<commit_message>
Update department information in InternalServiceAgreement.docx
</commit_message>
<xml_diff>
--- a/InternalServiceAgreement.docx
+++ b/InternalServiceAgreement.docx
@@ -569,6 +569,7 @@
     </w:p>
     <w:p>
       <w:pPr>
+        <w:contextualSpacing/>
         <w:tabs>
           <w:tab w:val="left" w:pos="1008"/>
           <w:tab w:val="left" w:pos="1440"/>
@@ -580,10 +581,10 @@
           <w:tab w:val="left" w:pos="6480"/>
         </w:tabs>
         <w:spacing w:line="240" w:lineRule="auto"/>
-        <w:ind w:leftChars="0" w:left="0" w:firstLineChars="0" w:firstLine="284"/>
-        <w:contextualSpacing/>
-        <w:rPr>
-          <w:rFonts w:asciiTheme="majorHAnsi" w:eastAsia="Calibri" w:hAnsiTheme="majorHAnsi" w:cstheme="majorHAnsi"/>
+        <w:ind w:left="0" w:firstLine="284"/>
+        <w:jc w:val="both"/>
+        <w:rPr>
+          <w:rFonts w:ascii="Calibri" w:hAnsi="Calibri" w:eastAsia="Calibri" w:cs="Calibri" w:asciiTheme="majorHAnsi" w:hAnsiTheme="majorHAnsi" w:csTheme="majorHAnsi"/>
           <w:b/>
           <w:sz w:val="22"/>
           <w:szCs w:val="22"/>
@@ -591,17 +592,19 @@
       </w:pPr>
       <w:r>
         <w:rPr>
-          <w:rFonts w:asciiTheme="majorHAnsi" w:eastAsia="Calibri" w:hAnsiTheme="majorHAnsi" w:cstheme="majorHAnsi"/>
+          <w:rFonts w:ascii="Calibri" w:hAnsi="Calibri" w:eastAsia="Calibri" w:cs="Calibri" w:asciiTheme="majorHAnsi" w:hAnsiTheme="majorHAnsi" w:csTheme="majorHAnsi"/>
           <w:b/>
-          <w:sz w:val="22"/>
-          <w:szCs w:val="22"/>
-        </w:rPr>
-        <w:t>DEPARTMENT OF CLINICAL PHYSIOLOGY AND NUCLEAR MEDICINE</w:t>
-      </w:r>
-      <w:r>
-        <w:rPr>
-          <w:rFonts w:asciiTheme="majorHAnsi" w:eastAsia="Calibri" w:hAnsiTheme="majorHAnsi" w:cstheme="majorHAnsi"/>
           <w:bCs/>
+          <w:position w:val="-1"/>
+          <w:sz w:val="22"/>
+          <w:szCs w:val="22"/>
+        </w:rPr>
+        <w:t>DEPARTMENT XXXX</w:t>
+      </w:r>
+      <w:r>
+        <w:rPr>
+          <w:rFonts w:ascii="Calibri" w:hAnsi="Calibri" w:eastAsia="Calibri" w:cs="Calibri" w:asciiTheme="majorHAnsi" w:hAnsiTheme="majorHAnsi" w:csTheme="majorHAnsi"/>
+          <w:position w:val="-1"/>
           <w:sz w:val="22"/>
           <w:szCs w:val="22"/>
         </w:rPr>
@@ -609,8 +612,10 @@
       </w:r>
       <w:r>
         <w:rPr>
-          <w:rFonts w:asciiTheme="majorHAnsi" w:eastAsia="Calibri" w:hAnsiTheme="majorHAnsi" w:cstheme="majorHAnsi"/>
+          <w:rFonts w:ascii="Calibri" w:hAnsi="Calibri" w:eastAsia="Calibri" w:cs="Calibri" w:asciiTheme="majorHAnsi" w:hAnsiTheme="majorHAnsi" w:csTheme="majorHAnsi"/>
           <w:b/>
+          <w:bCs/>
+          <w:position w:val="-1"/>
           <w:sz w:val="22"/>
           <w:szCs w:val="22"/>
         </w:rPr>
@@ -618,12 +623,12 @@
       </w:r>
       <w:r>
         <w:rPr>
-          <w:rFonts w:asciiTheme="majorHAnsi" w:eastAsia="Calibri" w:hAnsiTheme="majorHAnsi" w:cstheme="majorHAnsi"/>
-          <w:bCs/>
-          <w:sz w:val="22"/>
-          <w:szCs w:val="22"/>
-        </w:rPr>
-        <w:t>Section 4011</w:t>
+          <w:rFonts w:ascii="Calibri" w:hAnsi="Calibri" w:eastAsia="Calibri" w:cs="Calibri" w:asciiTheme="majorHAnsi" w:hAnsiTheme="majorHAnsi" w:csTheme="majorHAnsi"/>
+          <w:position w:val="-1"/>
+          <w:sz w:val="22"/>
+          <w:szCs w:val="22"/>
+        </w:rPr>
+        <w:t>Section xxxx</w:t>
       </w:r>
     </w:p>
     <w:p>
@@ -17719,7 +17724,7 @@
 </file>
 
 <file path=word/footer1.xml><?xml version="1.0" encoding="utf-8"?>
-<w:ftr xmlns:wpc="http://schemas.microsoft.com/office/word/2010/wordprocessingCanvas" xmlns:cx="http://schemas.microsoft.com/office/drawing/2014/chartex" xmlns:cx1="http://schemas.microsoft.com/office/drawing/2015/9/8/chartex" xmlns:cx2="http://schemas.microsoft.com/office/drawing/2015/10/21/chartex" xmlns:cx3="http://schemas.microsoft.com/office/drawing/2016/5/9/chartex" xmlns:cx4="http://schemas.microsoft.com/office/drawing/2016/5/10/chartex" xmlns:cx5="http://schemas.microsoft.com/office/drawing/2016/5/11/chartex" xmlns:cx6="http://schemas.microsoft.com/office/drawing/2016/5/12/chartex" xmlns:cx7="http://schemas.microsoft.com/office/drawing/2016/5/13/chartex" xmlns:cx8="http://schemas.microsoft.com/office/drawing/2016/5/14/chartex" xmlns:mc="http://schemas.openxmlformats.org/markup-compatibility/2006" xmlns:aink="http://schemas.microsoft.com/office/drawing/2016/ink" xmlns:am3d="http://schemas.microsoft.com/office/drawing/2017/model3d" xmlns:o="urn:schemas-microsoft-com:office:office" xmlns:oel="http://schemas.microsoft.com/office/2019/extlst" xmlns:r="http://schemas.openxmlformats.org/officeDocument/2006/relationships" xmlns:m="http://schemas.openxmlformats.org/officeDocument/2006/math" xmlns:v="urn:schemas-microsoft-com:vml" xmlns:wp14="http://schemas.microsoft.com/office/word/2010/wordprocessingDrawing" xmlns:wp="http://schemas.openxmlformats.org/drawingml/2006/wordprocessingDrawing" xmlns:w10="urn:schemas-microsoft-com:office:word" xmlns:w="http://schemas.openxmlformats.org/wordprocessingml/2006/main" xmlns:w14="http://schemas.microsoft.com/office/word/2010/wordml" xmlns:w15="http://schemas.microsoft.com/office/word/2012/wordml" xmlns:w16cex="http://schemas.microsoft.com/office/word/2018/wordml/cex" xmlns:w16cid="http://schemas.microsoft.com/office/word/2016/wordml/cid" xmlns:w16="http://schemas.microsoft.com/office/word/2018/wordml" xmlns:w16du="http://schemas.microsoft.com/office/word/2023/wordml/word16du" xmlns:w16sdtdh="http://schemas.microsoft.com/office/word/2020/wordml/sdtdatahash" xmlns:w16sdtfl="http://schemas.microsoft.com/office/word/2024/wordml/sdtformatlock" xmlns:w16se="http://schemas.microsoft.com/office/word/2015/wordml/symex" xmlns:wpg="http://schemas.microsoft.com/office/word/2010/wordprocessingGroup" xmlns:wpi="http://schemas.microsoft.com/office/word/2010/wordprocessingInk" xmlns:wne="http://schemas.microsoft.com/office/word/2006/wordml" xmlns:wps="http://schemas.microsoft.com/office/word/2010/wordprocessingShape" mc:Ignorable="w14 w15 w16se w16cid w16 w16cex w16sdtdh w16sdtfl w16du wp14">
+<w:ftr xmlns:wpc="http://schemas.microsoft.com/office/word/2010/wordprocessingCanvas" xmlns:mc="http://schemas.openxmlformats.org/markup-compatibility/2006" xmlns:o="urn:schemas-microsoft-com:office:office" xmlns:r="http://schemas.openxmlformats.org/officeDocument/2006/relationships" xmlns:m="http://schemas.openxmlformats.org/officeDocument/2006/math" xmlns:v="urn:schemas-microsoft-com:vml" xmlns:wp14="http://schemas.microsoft.com/office/word/2010/wordprocessingDrawing" xmlns:wp="http://schemas.openxmlformats.org/drawingml/2006/wordprocessingDrawing" xmlns:w10="urn:schemas-microsoft-com:office:word" xmlns:w="http://schemas.openxmlformats.org/wordprocessingml/2006/main" xmlns:w14="http://schemas.microsoft.com/office/word/2010/wordml" xmlns:w15="http://schemas.microsoft.com/office/word/2012/wordml" xmlns:w16se="http://schemas.microsoft.com/office/word/2015/wordml/symex" xmlns:w16cid="http://schemas.microsoft.com/office/word/2016/wordml/cid" xmlns:w16="http://schemas.microsoft.com/office/word/2018/wordml" xmlns:w16cex="http://schemas.microsoft.com/office/word/2018/wordml/cex" xmlns:w16sdtdh="http://schemas.microsoft.com/office/word/2020/wordml/sdtdatahash" xmlns:wne="http://schemas.microsoft.com/office/word/2006/wordml" xmlns:wpg="http://schemas.microsoft.com/office/word/2010/wordprocessingGroup" xmlns:wps="http://schemas.microsoft.com/office/word/2010/wordprocessingShape">
   <w:p>
     <w:pPr>
       <w:pBdr>
@@ -17787,7 +17792,7 @@
 </file>
 
 <file path=word/footer2.xml><?xml version="1.0" encoding="utf-8"?>
-<w:ftr xmlns:wpc="http://schemas.microsoft.com/office/word/2010/wordprocessingCanvas" xmlns:cx="http://schemas.microsoft.com/office/drawing/2014/chartex" xmlns:cx1="http://schemas.microsoft.com/office/drawing/2015/9/8/chartex" xmlns:cx2="http://schemas.microsoft.com/office/drawing/2015/10/21/chartex" xmlns:cx3="http://schemas.microsoft.com/office/drawing/2016/5/9/chartex" xmlns:cx4="http://schemas.microsoft.com/office/drawing/2016/5/10/chartex" xmlns:cx5="http://schemas.microsoft.com/office/drawing/2016/5/11/chartex" xmlns:cx6="http://schemas.microsoft.com/office/drawing/2016/5/12/chartex" xmlns:cx7="http://schemas.microsoft.com/office/drawing/2016/5/13/chartex" xmlns:cx8="http://schemas.microsoft.com/office/drawing/2016/5/14/chartex" xmlns:mc="http://schemas.openxmlformats.org/markup-compatibility/2006" xmlns:aink="http://schemas.microsoft.com/office/drawing/2016/ink" xmlns:am3d="http://schemas.microsoft.com/office/drawing/2017/model3d" xmlns:o="urn:schemas-microsoft-com:office:office" xmlns:oel="http://schemas.microsoft.com/office/2019/extlst" xmlns:r="http://schemas.openxmlformats.org/officeDocument/2006/relationships" xmlns:m="http://schemas.openxmlformats.org/officeDocument/2006/math" xmlns:v="urn:schemas-microsoft-com:vml" xmlns:wp14="http://schemas.microsoft.com/office/word/2010/wordprocessingDrawing" xmlns:wp="http://schemas.openxmlformats.org/drawingml/2006/wordprocessingDrawing" xmlns:w10="urn:schemas-microsoft-com:office:word" xmlns:w="http://schemas.openxmlformats.org/wordprocessingml/2006/main" xmlns:w14="http://schemas.microsoft.com/office/word/2010/wordml" xmlns:w15="http://schemas.microsoft.com/office/word/2012/wordml" xmlns:w16cex="http://schemas.microsoft.com/office/word/2018/wordml/cex" xmlns:w16cid="http://schemas.microsoft.com/office/word/2016/wordml/cid" xmlns:w16="http://schemas.microsoft.com/office/word/2018/wordml" xmlns:w16du="http://schemas.microsoft.com/office/word/2023/wordml/word16du" xmlns:w16sdtdh="http://schemas.microsoft.com/office/word/2020/wordml/sdtdatahash" xmlns:w16sdtfl="http://schemas.microsoft.com/office/word/2024/wordml/sdtformatlock" xmlns:w16se="http://schemas.microsoft.com/office/word/2015/wordml/symex" xmlns:wpg="http://schemas.microsoft.com/office/word/2010/wordprocessingGroup" xmlns:wpi="http://schemas.microsoft.com/office/word/2010/wordprocessingInk" xmlns:wne="http://schemas.microsoft.com/office/word/2006/wordml" xmlns:wps="http://schemas.microsoft.com/office/word/2010/wordprocessingShape" mc:Ignorable="w14 w15 w16se w16cid w16 w16cex w16sdtdh w16sdtfl w16du wp14">
+<w:ftr xmlns:wpc="http://schemas.microsoft.com/office/word/2010/wordprocessingCanvas" xmlns:mc="http://schemas.openxmlformats.org/markup-compatibility/2006" xmlns:o="urn:schemas-microsoft-com:office:office" xmlns:r="http://schemas.openxmlformats.org/officeDocument/2006/relationships" xmlns:m="http://schemas.openxmlformats.org/officeDocument/2006/math" xmlns:v="urn:schemas-microsoft-com:vml" xmlns:wp14="http://schemas.microsoft.com/office/word/2010/wordprocessingDrawing" xmlns:wp="http://schemas.openxmlformats.org/drawingml/2006/wordprocessingDrawing" xmlns:w10="urn:schemas-microsoft-com:office:word" xmlns:w="http://schemas.openxmlformats.org/wordprocessingml/2006/main" xmlns:w14="http://schemas.microsoft.com/office/word/2010/wordml" xmlns:w15="http://schemas.microsoft.com/office/word/2012/wordml" xmlns:w16se="http://schemas.microsoft.com/office/word/2015/wordml/symex" xmlns:w16cid="http://schemas.microsoft.com/office/word/2016/wordml/cid" xmlns:w16="http://schemas.microsoft.com/office/word/2018/wordml" xmlns:w16cex="http://schemas.microsoft.com/office/word/2018/wordml/cex" xmlns:w16sdtdh="http://schemas.microsoft.com/office/word/2020/wordml/sdtdatahash" xmlns:wne="http://schemas.microsoft.com/office/word/2006/wordml" xmlns:wpg="http://schemas.microsoft.com/office/word/2010/wordprocessingGroup" xmlns:wps="http://schemas.microsoft.com/office/word/2010/wordprocessingShape">
   <w:p>
     <w:pPr>
       <w:pBdr>
@@ -17827,7 +17832,6 @@
     </w:r>
     <w:r>
       <w:rPr>
-        <w:noProof/>
         <w:color w:val="000000"/>
       </w:rPr>
       <w:t>1</w:t>
@@ -17842,17 +17846,17 @@
   <w:tbl>
     <w:tblPr>
       <w:tblStyle w:val="TableGrid"/>
-      <w:tblpPr w:leftFromText="141" w:rightFromText="141" w:vertAnchor="text" w:horzAnchor="margin" w:tblpXSpec="center" w:tblpY="17"/>
+      <w:tblpPr w:horzAnchor="margin" w:vertAnchor="text" w:tblpXSpec="center" w:tblpY="17" w:leftFromText="141" w:rightFromText="141"/>
       <w:tblW w:w="0" w:type="auto"/>
       <w:tblBorders>
         <w:top w:val="single" w:sz="4" w:space="0" w:color="FF0000"/>
         <w:left w:val="single" w:sz="4" w:space="0" w:color="FF0000"/>
         <w:bottom w:val="single" w:sz="4" w:space="0" w:color="FF0000"/>
         <w:right w:val="single" w:sz="4" w:space="0" w:color="FF0000"/>
-        <w:insideH w:val="none" w:sz="0" w:space="0" w:color="auto"/>
-        <w:insideV w:val="none" w:sz="0" w:space="0" w:color="auto"/>
+        <w:insideH w:val="none"/>
+        <w:insideV w:val="none"/>
       </w:tblBorders>
-      <w:tblLook w:val="04A0" w:firstRow="1" w:lastRow="0" w:firstColumn="1" w:lastColumn="0" w:noHBand="0" w:noVBand="1"/>
+      <w:tblLook w:firstRow="1" w:firstColumn="1" w:noVBand="1"/>
     </w:tblPr>
     <w:tblGrid>
       <w:gridCol w:w="9106"/>
@@ -17873,141 +17877,125 @@
         </w:tcPr>
         <w:p>
           <w:pPr>
+            <w:contextualSpacing/>
             <w:spacing w:line="240" w:lineRule="auto"/>
-            <w:ind w:leftChars="0" w:left="0" w:firstLineChars="0" w:firstLine="0"/>
-            <w:contextualSpacing/>
-            <w:textDirection w:val="lrTb"/>
+            <w:ind w:left="0"/>
             <w:rPr>
-              <w:rFonts w:asciiTheme="majorHAnsi" w:hAnsiTheme="majorHAnsi" w:cstheme="majorHAnsi"/>
+              <w:rFonts w:ascii="Calibri" w:hAnsi="Calibri" w:cs="Calibri" w:asciiTheme="majorHAnsi" w:hAnsiTheme="majorHAnsi" w:csTheme="majorHAnsi"/>
               <w:bCs/>
-              <w:lang w:val="en-US"/>
             </w:rPr>
           </w:pPr>
         </w:p>
         <w:p>
           <w:pPr>
+            <w:contextualSpacing/>
             <w:spacing w:line="240" w:lineRule="auto"/>
-            <w:ind w:leftChars="0" w:left="0" w:firstLineChars="0" w:firstLine="0"/>
-            <w:contextualSpacing/>
+            <w:ind w:left="0"/>
             <w:jc w:val="center"/>
-            <w:textDirection w:val="lrTb"/>
             <w:rPr>
-              <w:rFonts w:asciiTheme="majorHAnsi" w:hAnsiTheme="majorHAnsi" w:cstheme="majorHAnsi"/>
+              <w:rFonts w:ascii="Calibri" w:hAnsi="Calibri" w:cs="Calibri" w:asciiTheme="majorHAnsi" w:hAnsiTheme="majorHAnsi" w:csTheme="majorHAnsi"/>
               <w:bCs/>
               <w:sz w:val="16"/>
               <w:szCs w:val="16"/>
-              <w:lang w:val="en-US"/>
             </w:rPr>
           </w:pPr>
           <w:r>
             <w:rPr>
-              <w:rFonts w:asciiTheme="majorHAnsi" w:hAnsiTheme="majorHAnsi" w:cstheme="majorHAnsi"/>
+              <w:rFonts w:ascii="Calibri" w:hAnsi="Calibri" w:cs="Calibri" w:asciiTheme="majorHAnsi" w:hAnsiTheme="majorHAnsi" w:csTheme="majorHAnsi"/>
               <w:bCs/>
               <w:sz w:val="16"/>
               <w:szCs w:val="16"/>
-              <w:lang w:val="en-US"/>
             </w:rPr>
             <w:t>All transfer</w:t>
           </w:r>
           <w:r>
             <w:rPr>
-              <w:rFonts w:asciiTheme="majorHAnsi" w:hAnsiTheme="majorHAnsi" w:cstheme="majorHAnsi"/>
+              <w:rFonts w:ascii="Calibri" w:hAnsi="Calibri" w:cs="Calibri" w:asciiTheme="majorHAnsi" w:hAnsiTheme="majorHAnsi" w:csTheme="majorHAnsi"/>
               <w:bCs/>
               <w:sz w:val="16"/>
               <w:szCs w:val="16"/>
-              <w:lang w:val="en-US"/>
             </w:rPr>
             <w:t>s</w:t>
           </w:r>
           <w:r>
             <w:rPr>
-              <w:rFonts w:asciiTheme="majorHAnsi" w:hAnsiTheme="majorHAnsi" w:cstheme="majorHAnsi"/>
+              <w:rFonts w:ascii="Calibri" w:hAnsi="Calibri" w:cs="Calibri" w:asciiTheme="majorHAnsi" w:hAnsiTheme="majorHAnsi" w:csTheme="majorHAnsi"/>
               <w:bCs/>
               <w:sz w:val="16"/>
               <w:szCs w:val="16"/>
-              <w:lang w:val="en-US"/>
             </w:rPr>
             <w:t xml:space="preserve"> of data governed by the agreement must be approved by </w:t>
           </w:r>
           <w:r>
             <w:rPr>
-              <w:rFonts w:asciiTheme="majorHAnsi" w:hAnsiTheme="majorHAnsi" w:cstheme="majorHAnsi"/>
+              <w:rFonts w:ascii="Calibri" w:hAnsi="Calibri" w:cs="Calibri" w:asciiTheme="majorHAnsi" w:hAnsiTheme="majorHAnsi" w:csTheme="majorHAnsi"/>
               <w:bCs/>
               <w:sz w:val="16"/>
               <w:szCs w:val="16"/>
-              <w:lang w:val="en-US"/>
             </w:rPr>
             <w:t xml:space="preserve">the </w:t>
           </w:r>
           <w:r>
             <w:rPr>
-              <w:rFonts w:asciiTheme="majorHAnsi" w:hAnsiTheme="majorHAnsi" w:cstheme="majorHAnsi"/>
+              <w:rFonts w:ascii="Calibri" w:hAnsi="Calibri" w:cs="Calibri" w:asciiTheme="majorHAnsi" w:hAnsiTheme="majorHAnsi" w:csTheme="majorHAnsi"/>
               <w:bCs/>
               <w:sz w:val="16"/>
               <w:szCs w:val="16"/>
-              <w:lang w:val="en-US"/>
             </w:rPr>
             <w:t>Department</w:t>
           </w:r>
           <w:r>
             <w:rPr>
-              <w:rFonts w:asciiTheme="majorHAnsi" w:hAnsiTheme="majorHAnsi" w:cstheme="majorHAnsi"/>
+              <w:rFonts w:ascii="Calibri" w:hAnsi="Calibri" w:cs="Calibri" w:asciiTheme="majorHAnsi" w:hAnsiTheme="majorHAnsi" w:csTheme="majorHAnsi"/>
               <w:bCs/>
               <w:sz w:val="16"/>
               <w:szCs w:val="16"/>
-              <w:lang w:val="en-US"/>
             </w:rPr>
             <w:t xml:space="preserve"> of Scientific Research</w:t>
           </w:r>
           <w:r>
             <w:rPr>
-              <w:rFonts w:asciiTheme="majorHAnsi" w:hAnsiTheme="majorHAnsi" w:cstheme="majorHAnsi"/>
+              <w:rFonts w:ascii="Calibri" w:hAnsi="Calibri" w:cs="Calibri" w:asciiTheme="majorHAnsi" w:hAnsiTheme="majorHAnsi" w:csTheme="majorHAnsi"/>
               <w:bCs/>
               <w:sz w:val="16"/>
               <w:szCs w:val="16"/>
-              <w:lang w:val="en-US"/>
             </w:rPr>
             <w:t xml:space="preserve"> (Forskningsjura) via Privacy registration for the project ”HEDIT: Healthy Digital Twin”, p-2023-14696.</w:t>
           </w:r>
         </w:p>
         <w:p>
           <w:pPr>
+            <w:contextualSpacing/>
             <w:spacing w:line="240" w:lineRule="auto"/>
-            <w:ind w:leftChars="0" w:left="0" w:firstLineChars="0" w:firstLine="0"/>
-            <w:contextualSpacing/>
+            <w:ind w:left="0"/>
             <w:jc w:val="center"/>
-            <w:textDirection w:val="lrTb"/>
             <w:rPr>
-              <w:rFonts w:asciiTheme="majorHAnsi" w:hAnsiTheme="majorHAnsi" w:cstheme="majorHAnsi"/>
+              <w:rFonts w:ascii="Calibri" w:hAnsi="Calibri" w:cs="Calibri" w:asciiTheme="majorHAnsi" w:hAnsiTheme="majorHAnsi" w:csTheme="majorHAnsi"/>
               <w:bCs/>
               <w:sz w:val="16"/>
               <w:szCs w:val="16"/>
-              <w:lang w:val="en-US"/>
             </w:rPr>
           </w:pPr>
         </w:p>
         <w:p>
           <w:pPr>
+            <w:contextualSpacing/>
             <w:spacing w:line="240" w:lineRule="auto"/>
-            <w:ind w:leftChars="0" w:left="0" w:firstLineChars="0" w:firstLine="0"/>
-            <w:contextualSpacing/>
+            <w:ind w:left="0"/>
             <w:jc w:val="center"/>
-            <w:textDirection w:val="lrTb"/>
             <w:rPr>
-              <w:rFonts w:asciiTheme="majorHAnsi" w:hAnsiTheme="majorHAnsi" w:cstheme="majorHAnsi"/>
+              <w:rFonts w:ascii="Calibri" w:hAnsi="Calibri" w:cs="Calibri" w:asciiTheme="majorHAnsi" w:hAnsiTheme="majorHAnsi" w:csTheme="majorHAnsi"/>
               <w:bCs/>
               <w:sz w:val="16"/>
               <w:szCs w:val="16"/>
-              <w:lang w:val="en-US"/>
             </w:rPr>
           </w:pPr>
           <w:r>
             <w:rPr>
-              <w:rFonts w:asciiTheme="majorHAnsi" w:hAnsiTheme="majorHAnsi" w:cstheme="majorHAnsi"/>
+              <w:rFonts w:ascii="Calibri" w:hAnsi="Calibri" w:cs="Calibri" w:asciiTheme="majorHAnsi" w:hAnsiTheme="majorHAnsi" w:csTheme="majorHAnsi"/>
               <w:bCs/>
               <w:sz w:val="16"/>
               <w:szCs w:val="16"/>
-              <w:lang w:val="en-US"/>
             </w:rPr>
             <w:t>Due to the internal nature of this agreement all clauses and provisions should be interpreted accordingly.</w:t>
           </w:r>
@@ -18038,7 +18026,7 @@
 </file>
 
 <file path=word/footer3.xml><?xml version="1.0" encoding="utf-8"?>
-<w:ftr xmlns:wpc="http://schemas.microsoft.com/office/word/2010/wordprocessingCanvas" xmlns:cx="http://schemas.microsoft.com/office/drawing/2014/chartex" xmlns:cx1="http://schemas.microsoft.com/office/drawing/2015/9/8/chartex" xmlns:cx2="http://schemas.microsoft.com/office/drawing/2015/10/21/chartex" xmlns:cx3="http://schemas.microsoft.com/office/drawing/2016/5/9/chartex" xmlns:cx4="http://schemas.microsoft.com/office/drawing/2016/5/10/chartex" xmlns:cx5="http://schemas.microsoft.com/office/drawing/2016/5/11/chartex" xmlns:cx6="http://schemas.microsoft.com/office/drawing/2016/5/12/chartex" xmlns:cx7="http://schemas.microsoft.com/office/drawing/2016/5/13/chartex" xmlns:cx8="http://schemas.microsoft.com/office/drawing/2016/5/14/chartex" xmlns:mc="http://schemas.openxmlformats.org/markup-compatibility/2006" xmlns:aink="http://schemas.microsoft.com/office/drawing/2016/ink" xmlns:am3d="http://schemas.microsoft.com/office/drawing/2017/model3d" xmlns:o="urn:schemas-microsoft-com:office:office" xmlns:oel="http://schemas.microsoft.com/office/2019/extlst" xmlns:r="http://schemas.openxmlformats.org/officeDocument/2006/relationships" xmlns:m="http://schemas.openxmlformats.org/officeDocument/2006/math" xmlns:v="urn:schemas-microsoft-com:vml" xmlns:wp14="http://schemas.microsoft.com/office/word/2010/wordprocessingDrawing" xmlns:wp="http://schemas.openxmlformats.org/drawingml/2006/wordprocessingDrawing" xmlns:w10="urn:schemas-microsoft-com:office:word" xmlns:w="http://schemas.openxmlformats.org/wordprocessingml/2006/main" xmlns:w14="http://schemas.microsoft.com/office/word/2010/wordml" xmlns:w15="http://schemas.microsoft.com/office/word/2012/wordml" xmlns:w16cex="http://schemas.microsoft.com/office/word/2018/wordml/cex" xmlns:w16cid="http://schemas.microsoft.com/office/word/2016/wordml/cid" xmlns:w16="http://schemas.microsoft.com/office/word/2018/wordml" xmlns:w16du="http://schemas.microsoft.com/office/word/2023/wordml/word16du" xmlns:w16sdtdh="http://schemas.microsoft.com/office/word/2020/wordml/sdtdatahash" xmlns:w16sdtfl="http://schemas.microsoft.com/office/word/2024/wordml/sdtformatlock" xmlns:w16se="http://schemas.microsoft.com/office/word/2015/wordml/symex" xmlns:wpg="http://schemas.microsoft.com/office/word/2010/wordprocessingGroup" xmlns:wpi="http://schemas.microsoft.com/office/word/2010/wordprocessingInk" xmlns:wne="http://schemas.microsoft.com/office/word/2006/wordml" xmlns:wps="http://schemas.microsoft.com/office/word/2010/wordprocessingShape" mc:Ignorable="w14 w15 w16se w16cid w16 w16cex w16sdtdh w16sdtfl w16du wp14">
+<w:ftr xmlns:wpc="http://schemas.microsoft.com/office/word/2010/wordprocessingCanvas" xmlns:mc="http://schemas.openxmlformats.org/markup-compatibility/2006" xmlns:o="urn:schemas-microsoft-com:office:office" xmlns:r="http://schemas.openxmlformats.org/officeDocument/2006/relationships" xmlns:m="http://schemas.openxmlformats.org/officeDocument/2006/math" xmlns:v="urn:schemas-microsoft-com:vml" xmlns:wp14="http://schemas.microsoft.com/office/word/2010/wordprocessingDrawing" xmlns:wp="http://schemas.openxmlformats.org/drawingml/2006/wordprocessingDrawing" xmlns:w10="urn:schemas-microsoft-com:office:word" xmlns:w="http://schemas.openxmlformats.org/wordprocessingml/2006/main" xmlns:w14="http://schemas.microsoft.com/office/word/2010/wordml" xmlns:w15="http://schemas.microsoft.com/office/word/2012/wordml" xmlns:w16se="http://schemas.microsoft.com/office/word/2015/wordml/symex" xmlns:w16cid="http://schemas.microsoft.com/office/word/2016/wordml/cid" xmlns:w16="http://schemas.microsoft.com/office/word/2018/wordml" xmlns:w16cex="http://schemas.microsoft.com/office/word/2018/wordml/cex" xmlns:w16sdtdh="http://schemas.microsoft.com/office/word/2020/wordml/sdtdatahash" xmlns:wne="http://schemas.microsoft.com/office/word/2006/wordml" xmlns:wpg="http://schemas.microsoft.com/office/word/2010/wordprocessingGroup" xmlns:wps="http://schemas.microsoft.com/office/word/2010/wordprocessingShape">
   <w:p>
     <w:pPr>
       <w:pStyle w:val="Footer"/>
@@ -18076,7 +18064,7 @@
 </file>
 
 <file path=word/header1.xml><?xml version="1.0" encoding="utf-8"?>
-<w:hdr xmlns:wpc="http://schemas.microsoft.com/office/word/2010/wordprocessingCanvas" xmlns:cx="http://schemas.microsoft.com/office/drawing/2014/chartex" xmlns:cx1="http://schemas.microsoft.com/office/drawing/2015/9/8/chartex" xmlns:cx2="http://schemas.microsoft.com/office/drawing/2015/10/21/chartex" xmlns:cx3="http://schemas.microsoft.com/office/drawing/2016/5/9/chartex" xmlns:cx4="http://schemas.microsoft.com/office/drawing/2016/5/10/chartex" xmlns:cx5="http://schemas.microsoft.com/office/drawing/2016/5/11/chartex" xmlns:cx6="http://schemas.microsoft.com/office/drawing/2016/5/12/chartex" xmlns:cx7="http://schemas.microsoft.com/office/drawing/2016/5/13/chartex" xmlns:cx8="http://schemas.microsoft.com/office/drawing/2016/5/14/chartex" xmlns:mc="http://schemas.openxmlformats.org/markup-compatibility/2006" xmlns:aink="http://schemas.microsoft.com/office/drawing/2016/ink" xmlns:am3d="http://schemas.microsoft.com/office/drawing/2017/model3d" xmlns:o="urn:schemas-microsoft-com:office:office" xmlns:oel="http://schemas.microsoft.com/office/2019/extlst" xmlns:r="http://schemas.openxmlformats.org/officeDocument/2006/relationships" xmlns:m="http://schemas.openxmlformats.org/officeDocument/2006/math" xmlns:v="urn:schemas-microsoft-com:vml" xmlns:wp14="http://schemas.microsoft.com/office/word/2010/wordprocessingDrawing" xmlns:wp="http://schemas.openxmlformats.org/drawingml/2006/wordprocessingDrawing" xmlns:w10="urn:schemas-microsoft-com:office:word" xmlns:w="http://schemas.openxmlformats.org/wordprocessingml/2006/main" xmlns:w14="http://schemas.microsoft.com/office/word/2010/wordml" xmlns:w15="http://schemas.microsoft.com/office/word/2012/wordml" xmlns:w16cex="http://schemas.microsoft.com/office/word/2018/wordml/cex" xmlns:w16cid="http://schemas.microsoft.com/office/word/2016/wordml/cid" xmlns:w16="http://schemas.microsoft.com/office/word/2018/wordml" xmlns:w16du="http://schemas.microsoft.com/office/word/2023/wordml/word16du" xmlns:w16sdtdh="http://schemas.microsoft.com/office/word/2020/wordml/sdtdatahash" xmlns:w16sdtfl="http://schemas.microsoft.com/office/word/2024/wordml/sdtformatlock" xmlns:w16se="http://schemas.microsoft.com/office/word/2015/wordml/symex" xmlns:wpg="http://schemas.microsoft.com/office/word/2010/wordprocessingGroup" xmlns:wpi="http://schemas.microsoft.com/office/word/2010/wordprocessingInk" xmlns:wne="http://schemas.microsoft.com/office/word/2006/wordml" xmlns:wps="http://schemas.microsoft.com/office/word/2010/wordprocessingShape" mc:Ignorable="w14 w15 w16se w16cid w16 w16cex w16sdtdh w16sdtfl w16du wp14">
+<w:hdr xmlns:wpc="http://schemas.microsoft.com/office/word/2010/wordprocessingCanvas" xmlns:mc="http://schemas.openxmlformats.org/markup-compatibility/2006" xmlns:o="urn:schemas-microsoft-com:office:office" xmlns:r="http://schemas.openxmlformats.org/officeDocument/2006/relationships" xmlns:m="http://schemas.openxmlformats.org/officeDocument/2006/math" xmlns:v="urn:schemas-microsoft-com:vml" xmlns:wp14="http://schemas.microsoft.com/office/word/2010/wordprocessingDrawing" xmlns:wp="http://schemas.openxmlformats.org/drawingml/2006/wordprocessingDrawing" xmlns:w10="urn:schemas-microsoft-com:office:word" xmlns:w="http://schemas.openxmlformats.org/wordprocessingml/2006/main" xmlns:w14="http://schemas.microsoft.com/office/word/2010/wordml" xmlns:w15="http://schemas.microsoft.com/office/word/2012/wordml" xmlns:w16se="http://schemas.microsoft.com/office/word/2015/wordml/symex" xmlns:w16cid="http://schemas.microsoft.com/office/word/2016/wordml/cid" xmlns:w16="http://schemas.microsoft.com/office/word/2018/wordml" xmlns:w16cex="http://schemas.microsoft.com/office/word/2018/wordml/cex" xmlns:w16sdtdh="http://schemas.microsoft.com/office/word/2020/wordml/sdtdatahash" xmlns:wne="http://schemas.microsoft.com/office/word/2006/wordml" xmlns:wpg="http://schemas.microsoft.com/office/word/2010/wordprocessingGroup" xmlns:wps="http://schemas.microsoft.com/office/word/2010/wordprocessingShape">
   <w:p>
     <w:pPr>
       <w:pStyle w:val="Header"/>
@@ -18087,7 +18075,7 @@
 </file>
 
 <file path=word/header2.xml><?xml version="1.0" encoding="utf-8"?>
-<w:hdr xmlns:wpc="http://schemas.microsoft.com/office/word/2010/wordprocessingCanvas" xmlns:cx="http://schemas.microsoft.com/office/drawing/2014/chartex" xmlns:cx1="http://schemas.microsoft.com/office/drawing/2015/9/8/chartex" xmlns:cx2="http://schemas.microsoft.com/office/drawing/2015/10/21/chartex" xmlns:cx3="http://schemas.microsoft.com/office/drawing/2016/5/9/chartex" xmlns:cx4="http://schemas.microsoft.com/office/drawing/2016/5/10/chartex" xmlns:cx5="http://schemas.microsoft.com/office/drawing/2016/5/11/chartex" xmlns:cx6="http://schemas.microsoft.com/office/drawing/2016/5/12/chartex" xmlns:cx7="http://schemas.microsoft.com/office/drawing/2016/5/13/chartex" xmlns:cx8="http://schemas.microsoft.com/office/drawing/2016/5/14/chartex" xmlns:mc="http://schemas.openxmlformats.org/markup-compatibility/2006" xmlns:aink="http://schemas.microsoft.com/office/drawing/2016/ink" xmlns:am3d="http://schemas.microsoft.com/office/drawing/2017/model3d" xmlns:o="urn:schemas-microsoft-com:office:office" xmlns:oel="http://schemas.microsoft.com/office/2019/extlst" xmlns:r="http://schemas.openxmlformats.org/officeDocument/2006/relationships" xmlns:m="http://schemas.openxmlformats.org/officeDocument/2006/math" xmlns:v="urn:schemas-microsoft-com:vml" xmlns:wp14="http://schemas.microsoft.com/office/word/2010/wordprocessingDrawing" xmlns:wp="http://schemas.openxmlformats.org/drawingml/2006/wordprocessingDrawing" xmlns:w10="urn:schemas-microsoft-com:office:word" xmlns:w="http://schemas.openxmlformats.org/wordprocessingml/2006/main" xmlns:w14="http://schemas.microsoft.com/office/word/2010/wordml" xmlns:w15="http://schemas.microsoft.com/office/word/2012/wordml" xmlns:w16cex="http://schemas.microsoft.com/office/word/2018/wordml/cex" xmlns:w16cid="http://schemas.microsoft.com/office/word/2016/wordml/cid" xmlns:w16="http://schemas.microsoft.com/office/word/2018/wordml" xmlns:w16du="http://schemas.microsoft.com/office/word/2023/wordml/word16du" xmlns:w16sdtdh="http://schemas.microsoft.com/office/word/2020/wordml/sdtdatahash" xmlns:w16sdtfl="http://schemas.microsoft.com/office/word/2024/wordml/sdtformatlock" xmlns:w16se="http://schemas.microsoft.com/office/word/2015/wordml/symex" xmlns:wpg="http://schemas.microsoft.com/office/word/2010/wordprocessingGroup" xmlns:wpi="http://schemas.microsoft.com/office/word/2010/wordprocessingInk" xmlns:wne="http://schemas.microsoft.com/office/word/2006/wordml" xmlns:wps="http://schemas.microsoft.com/office/word/2010/wordprocessingShape" mc:Ignorable="w14 w15 w16se w16cid w16 w16cex w16sdtdh w16sdtfl w16du wp14">
+<w:hdr xmlns:wpc="http://schemas.microsoft.com/office/word/2010/wordprocessingCanvas" xmlns:mc="http://schemas.openxmlformats.org/markup-compatibility/2006" xmlns:o="urn:schemas-microsoft-com:office:office" xmlns:r="http://schemas.openxmlformats.org/officeDocument/2006/relationships" xmlns:m="http://schemas.openxmlformats.org/officeDocument/2006/math" xmlns:v="urn:schemas-microsoft-com:vml" xmlns:wp14="http://schemas.microsoft.com/office/word/2010/wordprocessingDrawing" xmlns:wp="http://schemas.openxmlformats.org/drawingml/2006/wordprocessingDrawing" xmlns:w10="urn:schemas-microsoft-com:office:word" xmlns:w="http://schemas.openxmlformats.org/wordprocessingml/2006/main" xmlns:w14="http://schemas.microsoft.com/office/word/2010/wordml" xmlns:w15="http://schemas.microsoft.com/office/word/2012/wordml" xmlns:w16se="http://schemas.microsoft.com/office/word/2015/wordml/symex" xmlns:w16cid="http://schemas.microsoft.com/office/word/2016/wordml/cid" xmlns:w16="http://schemas.microsoft.com/office/word/2018/wordml" xmlns:w16cex="http://schemas.microsoft.com/office/word/2018/wordml/cex" xmlns:w16sdtdh="http://schemas.microsoft.com/office/word/2020/wordml/sdtdatahash" xmlns:wne="http://schemas.microsoft.com/office/word/2006/wordml" xmlns:wpg="http://schemas.microsoft.com/office/word/2010/wordprocessingGroup" xmlns:wps="http://schemas.microsoft.com/office/word/2010/wordprocessingShape">
   <w:p>
     <w:pPr>
       <w:pStyle w:val="Header"/>
@@ -18098,7 +18086,7 @@
 </file>
 
 <file path=word/header3.xml><?xml version="1.0" encoding="utf-8"?>
-<w:hdr xmlns:wpc="http://schemas.microsoft.com/office/word/2010/wordprocessingCanvas" xmlns:cx="http://schemas.microsoft.com/office/drawing/2014/chartex" xmlns:cx1="http://schemas.microsoft.com/office/drawing/2015/9/8/chartex" xmlns:cx2="http://schemas.microsoft.com/office/drawing/2015/10/21/chartex" xmlns:cx3="http://schemas.microsoft.com/office/drawing/2016/5/9/chartex" xmlns:cx4="http://schemas.microsoft.com/office/drawing/2016/5/10/chartex" xmlns:cx5="http://schemas.microsoft.com/office/drawing/2016/5/11/chartex" xmlns:cx6="http://schemas.microsoft.com/office/drawing/2016/5/12/chartex" xmlns:cx7="http://schemas.microsoft.com/office/drawing/2016/5/13/chartex" xmlns:cx8="http://schemas.microsoft.com/office/drawing/2016/5/14/chartex" xmlns:mc="http://schemas.openxmlformats.org/markup-compatibility/2006" xmlns:aink="http://schemas.microsoft.com/office/drawing/2016/ink" xmlns:am3d="http://schemas.microsoft.com/office/drawing/2017/model3d" xmlns:o="urn:schemas-microsoft-com:office:office" xmlns:oel="http://schemas.microsoft.com/office/2019/extlst" xmlns:r="http://schemas.openxmlformats.org/officeDocument/2006/relationships" xmlns:m="http://schemas.openxmlformats.org/officeDocument/2006/math" xmlns:v="urn:schemas-microsoft-com:vml" xmlns:wp14="http://schemas.microsoft.com/office/word/2010/wordprocessingDrawing" xmlns:wp="http://schemas.openxmlformats.org/drawingml/2006/wordprocessingDrawing" xmlns:w10="urn:schemas-microsoft-com:office:word" xmlns:w="http://schemas.openxmlformats.org/wordprocessingml/2006/main" xmlns:w14="http://schemas.microsoft.com/office/word/2010/wordml" xmlns:w15="http://schemas.microsoft.com/office/word/2012/wordml" xmlns:w16cex="http://schemas.microsoft.com/office/word/2018/wordml/cex" xmlns:w16cid="http://schemas.microsoft.com/office/word/2016/wordml/cid" xmlns:w16="http://schemas.microsoft.com/office/word/2018/wordml" xmlns:w16du="http://schemas.microsoft.com/office/word/2023/wordml/word16du" xmlns:w16sdtdh="http://schemas.microsoft.com/office/word/2020/wordml/sdtdatahash" xmlns:w16sdtfl="http://schemas.microsoft.com/office/word/2024/wordml/sdtformatlock" xmlns:w16se="http://schemas.microsoft.com/office/word/2015/wordml/symex" xmlns:wpg="http://schemas.microsoft.com/office/word/2010/wordprocessingGroup" xmlns:wpi="http://schemas.microsoft.com/office/word/2010/wordprocessingInk" xmlns:wne="http://schemas.microsoft.com/office/word/2006/wordml" xmlns:wps="http://schemas.microsoft.com/office/word/2010/wordprocessingShape" mc:Ignorable="w14 w15 w16se w16cid w16 w16cex w16sdtdh w16sdtfl w16du wp14">
+<w:hdr xmlns:wpc="http://schemas.microsoft.com/office/word/2010/wordprocessingCanvas" xmlns:mc="http://schemas.openxmlformats.org/markup-compatibility/2006" xmlns:o="urn:schemas-microsoft-com:office:office" xmlns:r="http://schemas.openxmlformats.org/officeDocument/2006/relationships" xmlns:m="http://schemas.openxmlformats.org/officeDocument/2006/math" xmlns:v="urn:schemas-microsoft-com:vml" xmlns:wp14="http://schemas.microsoft.com/office/word/2010/wordprocessingDrawing" xmlns:wp="http://schemas.openxmlformats.org/drawingml/2006/wordprocessingDrawing" xmlns:w10="urn:schemas-microsoft-com:office:word" xmlns:w="http://schemas.openxmlformats.org/wordprocessingml/2006/main" xmlns:w14="http://schemas.microsoft.com/office/word/2010/wordml" xmlns:w15="http://schemas.microsoft.com/office/word/2012/wordml" xmlns:w16se="http://schemas.microsoft.com/office/word/2015/wordml/symex" xmlns:w16cid="http://schemas.microsoft.com/office/word/2016/wordml/cid" xmlns:w16="http://schemas.microsoft.com/office/word/2018/wordml" xmlns:w16cex="http://schemas.microsoft.com/office/word/2018/wordml/cex" xmlns:w16sdtdh="http://schemas.microsoft.com/office/word/2020/wordml/sdtdatahash" xmlns:wne="http://schemas.microsoft.com/office/word/2006/wordml" xmlns:wpg="http://schemas.microsoft.com/office/word/2010/wordprocessingGroup" xmlns:wps="http://schemas.microsoft.com/office/word/2010/wordprocessingShape">
   <w:p>
     <w:pPr>
       <w:pStyle w:val="Header"/>

</xml_diff>

<commit_message>
ensures consistency among contracts
</commit_message>
<xml_diff>
--- a/InternalServiceAgreement.docx
+++ b/InternalServiceAgreement.docx
@@ -19,49 +19,59 @@
           <w:szCs w:val="22"/>
         </w:rPr>
       </w:pPr>
-      <w:hyperlink r:id="rId9">
-        <w:r>
-          <w:rPr>
-            <w:noProof/>
-            <w:color w:val="0000FF"/>
-          </w:rPr>
-          <w:drawing>
-            <wp:inline distT="0" distB="0" distL="114300" distR="114300" wp14:anchorId="223A9D33" wp14:editId="3DAD7BE7">
-              <wp:extent cx="2085340" cy="732155"/>
-              <wp:effectExtent l="0" t="0" r="0" b="0"/>
-              <wp:docPr id="1027" name="image1.png" descr="Fil:Region hovedstaden logo.png"/>
-              <wp:cNvGraphicFramePr/>
-              <a:graphic xmlns:a="http://schemas.openxmlformats.org/drawingml/2006/main">
-                <a:graphicData uri="http://schemas.openxmlformats.org/drawingml/2006/picture">
-                  <pic:pic xmlns:pic="http://schemas.openxmlformats.org/drawingml/2006/picture">
-                    <pic:nvPicPr>
-                      <pic:cNvPr id="0" name="image1.png" descr="Fil:Region hovedstaden logo.png"/>
-                      <pic:cNvPicPr preferRelativeResize="0"/>
-                    </pic:nvPicPr>
-                    <pic:blipFill>
-                      <a:blip r:embed="rId10"/>
-                      <a:srcRect/>
-                      <a:stretch>
-                        <a:fillRect/>
-                      </a:stretch>
-                    </pic:blipFill>
-                    <pic:spPr>
-                      <a:xfrm>
-                        <a:off x="0" y="0"/>
-                        <a:ext cx="2085340" cy="732155"/>
-                      </a:xfrm>
-                      <a:prstGeom prst="rect">
-                        <a:avLst/>
-                      </a:prstGeom>
-                      <a:ln/>
-                    </pic:spPr>
-                  </pic:pic>
-                </a:graphicData>
-              </a:graphic>
-            </wp:inline>
-          </w:drawing>
-        </w:r>
-      </w:hyperlink>
+      <w:r>
+        <w:fldChar w:fldCharType="begin"/>
+      </w:r>
+      <w:r>
+        <w:instrText>HYPERLINK "http://upload.wikimedia.org/wikipedia/commons/b/bc/Region_hovedstaden_logo.png" \h</w:instrText>
+      </w:r>
+      <w:r>
+        <w:fldChar w:fldCharType="separate"/>
+      </w:r>
+      <w:r>
+        <w:rPr>
+          <w:noProof/>
+          <w:color w:val="0000FF"/>
+        </w:rPr>
+        <w:drawing>
+          <wp:inline distT="0" distB="0" distL="114300" distR="114300" wp14:anchorId="223A9D33" wp14:editId="3DAD7BE7">
+            <wp:extent cx="2085340" cy="732155"/>
+            <wp:effectExtent l="0" t="0" r="0" b="0"/>
+            <wp:docPr id="1027" name="image1.png" descr="Fil:Region hovedstaden logo.png"/>
+            <wp:cNvGraphicFramePr/>
+            <a:graphic xmlns:a="http://schemas.openxmlformats.org/drawingml/2006/main">
+              <a:graphicData uri="http://schemas.openxmlformats.org/drawingml/2006/picture">
+                <pic:pic xmlns:pic="http://schemas.openxmlformats.org/drawingml/2006/picture">
+                  <pic:nvPicPr>
+                    <pic:cNvPr id="0" name="image1.png" descr="Fil:Region hovedstaden logo.png"/>
+                    <pic:cNvPicPr preferRelativeResize="0"/>
+                  </pic:nvPicPr>
+                  <pic:blipFill>
+                    <a:blip r:embed="rId9"/>
+                    <a:srcRect/>
+                    <a:stretch>
+                      <a:fillRect/>
+                    </a:stretch>
+                  </pic:blipFill>
+                  <pic:spPr>
+                    <a:xfrm>
+                      <a:off x="0" y="0"/>
+                      <a:ext cx="2085340" cy="732155"/>
+                    </a:xfrm>
+                    <a:prstGeom prst="rect">
+                      <a:avLst/>
+                    </a:prstGeom>
+                    <a:ln/>
+                  </pic:spPr>
+                </pic:pic>
+              </a:graphicData>
+            </a:graphic>
+          </wp:inline>
+        </w:drawing>
+      </w:r>
+      <w:r>
+        <w:fldChar w:fldCharType="end"/>
+      </w:r>
     </w:p>
     <w:p>
       <w:pPr>
@@ -249,7 +259,25 @@
           <w:sz w:val="22"/>
           <w:szCs w:val="22"/>
         </w:rPr>
-        <w:t xml:space="preserve">Region Hovedstaden, </w:t>
+        <w:t xml:space="preserve">Region </w:t>
+      </w:r>
+      <w:proofErr w:type="spellStart"/>
+      <w:r>
+        <w:rPr>
+          <w:rFonts w:asciiTheme="majorHAnsi" w:eastAsia="Calibri" w:hAnsiTheme="majorHAnsi" w:cstheme="majorHAnsi"/>
+          <w:sz w:val="22"/>
+          <w:szCs w:val="22"/>
+        </w:rPr>
+        <w:t>Hovedstaden</w:t>
+      </w:r>
+      <w:proofErr w:type="spellEnd"/>
+      <w:r>
+        <w:rPr>
+          <w:rFonts w:asciiTheme="majorHAnsi" w:eastAsia="Calibri" w:hAnsiTheme="majorHAnsi" w:cstheme="majorHAnsi"/>
+          <w:sz w:val="22"/>
+          <w:szCs w:val="22"/>
+        </w:rPr>
+        <w:t xml:space="preserve">, </w:t>
       </w:r>
       <w:r>
         <w:rPr>
@@ -259,6 +287,7 @@
         </w:rPr>
         <w:t xml:space="preserve">Rigshospitalet, </w:t>
       </w:r>
+      <w:proofErr w:type="spellStart"/>
       <w:r>
         <w:rPr>
           <w:rFonts w:asciiTheme="majorHAnsi" w:eastAsia="Calibri" w:hAnsiTheme="majorHAnsi" w:cstheme="majorHAnsi"/>
@@ -266,7 +295,17 @@
           <w:szCs w:val="22"/>
           <w:lang w:val="en-US"/>
         </w:rPr>
-        <w:t>Blegdamsvej 9, DK-2100 Copenhagen, Denmark</w:t>
+        <w:t>Blegdamsvej</w:t>
+      </w:r>
+      <w:proofErr w:type="spellEnd"/>
+      <w:r>
+        <w:rPr>
+          <w:rFonts w:asciiTheme="majorHAnsi" w:eastAsia="Calibri" w:hAnsiTheme="majorHAnsi" w:cstheme="majorHAnsi"/>
+          <w:sz w:val="22"/>
+          <w:szCs w:val="22"/>
+          <w:lang w:val="en-US"/>
+        </w:rPr>
+        <w:t xml:space="preserve"> 9, DK-2100 Copenhagen, Denmark</w:t>
       </w:r>
       <w:r>
         <w:rPr>
@@ -435,7 +474,7 @@
         </w:rPr>
         <w:t xml:space="preserve"> </w:t>
       </w:r>
-      <w:hyperlink r:id="rId11" w:history="1">
+      <w:hyperlink r:id="rId10" w:history="1">
         <w:r>
           <w:rPr>
             <w:rStyle w:val="Hyperlink"/>
@@ -569,7 +608,6 @@
     </w:p>
     <w:p>
       <w:pPr>
-        <w:contextualSpacing/>
         <w:tabs>
           <w:tab w:val="left" w:pos="1008"/>
           <w:tab w:val="left" w:pos="1440"/>
@@ -581,10 +619,10 @@
           <w:tab w:val="left" w:pos="6480"/>
         </w:tabs>
         <w:spacing w:line="240" w:lineRule="auto"/>
-        <w:ind w:left="0" w:firstLine="284"/>
-        <w:jc w:val="both"/>
-        <w:rPr>
-          <w:rFonts w:ascii="Calibri" w:hAnsi="Calibri" w:eastAsia="Calibri" w:cs="Calibri" w:asciiTheme="majorHAnsi" w:hAnsiTheme="majorHAnsi" w:csTheme="majorHAnsi"/>
+        <w:ind w:left="0" w:hanging="2"/>
+        <w:contextualSpacing/>
+        <w:rPr>
+          <w:rFonts w:asciiTheme="majorHAnsi" w:eastAsia="Calibri" w:hAnsiTheme="majorHAnsi" w:cs="Calibri"/>
           <w:b/>
           <w:sz w:val="22"/>
           <w:szCs w:val="22"/>
@@ -592,10 +630,9 @@
       </w:pPr>
       <w:r>
         <w:rPr>
-          <w:rFonts w:ascii="Calibri" w:hAnsi="Calibri" w:eastAsia="Calibri" w:cs="Calibri" w:asciiTheme="majorHAnsi" w:hAnsiTheme="majorHAnsi" w:csTheme="majorHAnsi"/>
+          <w:rFonts w:asciiTheme="majorHAnsi" w:eastAsia="Calibri" w:hAnsiTheme="majorHAnsi" w:cs="Calibri"/>
           <w:b/>
           <w:bCs/>
-          <w:position w:val="-1"/>
           <w:sz w:val="22"/>
           <w:szCs w:val="22"/>
         </w:rPr>
@@ -603,8 +640,7 @@
       </w:r>
       <w:r>
         <w:rPr>
-          <w:rFonts w:ascii="Calibri" w:hAnsi="Calibri" w:eastAsia="Calibri" w:cs="Calibri" w:asciiTheme="majorHAnsi" w:hAnsiTheme="majorHAnsi" w:csTheme="majorHAnsi"/>
-          <w:position w:val="-1"/>
+          <w:rFonts w:asciiTheme="majorHAnsi" w:eastAsia="Calibri" w:hAnsiTheme="majorHAnsi" w:cs="Calibri"/>
           <w:sz w:val="22"/>
           <w:szCs w:val="22"/>
         </w:rPr>
@@ -612,10 +648,9 @@
       </w:r>
       <w:r>
         <w:rPr>
-          <w:rFonts w:ascii="Calibri" w:hAnsi="Calibri" w:eastAsia="Calibri" w:cs="Calibri" w:asciiTheme="majorHAnsi" w:hAnsiTheme="majorHAnsi" w:csTheme="majorHAnsi"/>
+          <w:rFonts w:asciiTheme="majorHAnsi" w:eastAsia="Calibri" w:hAnsiTheme="majorHAnsi" w:cs="Calibri"/>
           <w:b/>
           <w:bCs/>
-          <w:position w:val="-1"/>
           <w:sz w:val="22"/>
           <w:szCs w:val="22"/>
         </w:rPr>
@@ -623,13 +658,22 @@
       </w:r>
       <w:r>
         <w:rPr>
-          <w:rFonts w:ascii="Calibri" w:hAnsi="Calibri" w:eastAsia="Calibri" w:cs="Calibri" w:asciiTheme="majorHAnsi" w:hAnsiTheme="majorHAnsi" w:csTheme="majorHAnsi"/>
-          <w:position w:val="-1"/>
-          <w:sz w:val="22"/>
-          <w:szCs w:val="22"/>
-        </w:rPr>
-        <w:t>Section xxxx</w:t>
-      </w:r>
+          <w:rFonts w:asciiTheme="majorHAnsi" w:eastAsia="Calibri" w:hAnsiTheme="majorHAnsi" w:cs="Calibri"/>
+          <w:sz w:val="22"/>
+          <w:szCs w:val="22"/>
+        </w:rPr>
+        <w:t xml:space="preserve">Section </w:t>
+      </w:r>
+      <w:proofErr w:type="spellStart"/>
+      <w:r>
+        <w:rPr>
+          <w:rFonts w:asciiTheme="majorHAnsi" w:eastAsia="Calibri" w:hAnsiTheme="majorHAnsi" w:cs="Calibri"/>
+          <w:sz w:val="22"/>
+          <w:szCs w:val="22"/>
+        </w:rPr>
+        <w:t>xxxx</w:t>
+      </w:r>
+      <w:proofErr w:type="spellEnd"/>
     </w:p>
     <w:p>
       <w:pPr>
@@ -1020,7 +1064,31 @@
           <w:szCs w:val="22"/>
           <w:highlight w:val="white"/>
         </w:rPr>
-        <w:t xml:space="preserve"> (the Public-nEUro platform, detailed in Schedule A that facilitates sharing</w:t>
+        <w:t xml:space="preserve"> (the Public-</w:t>
+      </w:r>
+      <w:proofErr w:type="spellStart"/>
+      <w:r>
+        <w:rPr>
+          <w:rFonts w:asciiTheme="majorHAnsi" w:eastAsia="Calibri" w:hAnsiTheme="majorHAnsi" w:cstheme="majorHAnsi"/>
+          <w:bCs/>
+          <w:color w:val="222222"/>
+          <w:sz w:val="22"/>
+          <w:szCs w:val="22"/>
+          <w:highlight w:val="white"/>
+        </w:rPr>
+        <w:t>nEUro</w:t>
+      </w:r>
+      <w:proofErr w:type="spellEnd"/>
+      <w:r>
+        <w:rPr>
+          <w:rFonts w:asciiTheme="majorHAnsi" w:eastAsia="Calibri" w:hAnsiTheme="majorHAnsi" w:cstheme="majorHAnsi"/>
+          <w:bCs/>
+          <w:color w:val="222222"/>
+          <w:sz w:val="22"/>
+          <w:szCs w:val="22"/>
+          <w:highlight w:val="white"/>
+        </w:rPr>
+        <w:t xml:space="preserve"> platform, detailed in Schedule A that facilitates sharing</w:t>
       </w:r>
       <w:r>
         <w:rPr>
@@ -1264,7 +1332,31 @@
           <w:szCs w:val="22"/>
           <w:highlight w:val="white"/>
         </w:rPr>
-        <w:t>Public-nEUro platform</w:t>
+        <w:t>Public-</w:t>
+      </w:r>
+      <w:proofErr w:type="spellStart"/>
+      <w:r>
+        <w:rPr>
+          <w:rFonts w:asciiTheme="majorHAnsi" w:eastAsia="Calibri" w:hAnsiTheme="majorHAnsi" w:cstheme="majorHAnsi"/>
+          <w:bCs/>
+          <w:color w:val="222222"/>
+          <w:sz w:val="22"/>
+          <w:szCs w:val="22"/>
+          <w:highlight w:val="white"/>
+        </w:rPr>
+        <w:t>nEUro</w:t>
+      </w:r>
+      <w:proofErr w:type="spellEnd"/>
+      <w:r>
+        <w:rPr>
+          <w:rFonts w:asciiTheme="majorHAnsi" w:eastAsia="Calibri" w:hAnsiTheme="majorHAnsi" w:cstheme="majorHAnsi"/>
+          <w:bCs/>
+          <w:color w:val="222222"/>
+          <w:sz w:val="22"/>
+          <w:szCs w:val="22"/>
+          <w:highlight w:val="white"/>
+        </w:rPr>
+        <w:t xml:space="preserve"> platform</w:t>
       </w:r>
       <w:r>
         <w:rPr>
@@ -2795,7 +2887,27 @@
           <w:sz w:val="22"/>
           <w:szCs w:val="22"/>
         </w:rPr>
-        <w:t xml:space="preserve">Due to the internal nature of the agreement the parties acknowledge to be governed by Region Hovedstaden as data controller. </w:t>
+        <w:t xml:space="preserve">Due to the internal nature of the agreement the parties acknowledge to be governed by Region </w:t>
+      </w:r>
+      <w:proofErr w:type="spellStart"/>
+      <w:r>
+        <w:rPr>
+          <w:rFonts w:asciiTheme="majorHAnsi" w:eastAsia="Calibri" w:hAnsiTheme="majorHAnsi" w:cstheme="majorHAnsi"/>
+          <w:color w:val="EE0000"/>
+          <w:sz w:val="22"/>
+          <w:szCs w:val="22"/>
+        </w:rPr>
+        <w:t>Hovedstaden</w:t>
+      </w:r>
+      <w:proofErr w:type="spellEnd"/>
+      <w:r>
+        <w:rPr>
+          <w:rFonts w:asciiTheme="majorHAnsi" w:eastAsia="Calibri" w:hAnsiTheme="majorHAnsi" w:cstheme="majorHAnsi"/>
+          <w:color w:val="EE0000"/>
+          <w:sz w:val="22"/>
+          <w:szCs w:val="22"/>
+        </w:rPr>
+        <w:t xml:space="preserve"> as data controller. </w:t>
       </w:r>
     </w:p>
     <w:p>
@@ -3653,8 +3765,36 @@
           <w:sz w:val="22"/>
           <w:szCs w:val="22"/>
         </w:rPr>
-        <w:t>Head of OpenNeuroPET, Technical Lead of Public-nEUro</w:t>
-      </w:r>
+        <w:t xml:space="preserve">Head of </w:t>
+      </w:r>
+      <w:proofErr w:type="spellStart"/>
+      <w:r>
+        <w:rPr>
+          <w:rFonts w:asciiTheme="majorHAnsi" w:eastAsia="Calibri" w:hAnsiTheme="majorHAnsi" w:cstheme="majorHAnsi"/>
+          <w:sz w:val="22"/>
+          <w:szCs w:val="22"/>
+        </w:rPr>
+        <w:t>OpenNeuroPET</w:t>
+      </w:r>
+      <w:proofErr w:type="spellEnd"/>
+      <w:r>
+        <w:rPr>
+          <w:rFonts w:asciiTheme="majorHAnsi" w:eastAsia="Calibri" w:hAnsiTheme="majorHAnsi" w:cstheme="majorHAnsi"/>
+          <w:sz w:val="22"/>
+          <w:szCs w:val="22"/>
+        </w:rPr>
+        <w:t>, Technical Lead of Public-</w:t>
+      </w:r>
+      <w:proofErr w:type="spellStart"/>
+      <w:r>
+        <w:rPr>
+          <w:rFonts w:asciiTheme="majorHAnsi" w:eastAsia="Calibri" w:hAnsiTheme="majorHAnsi" w:cstheme="majorHAnsi"/>
+          <w:sz w:val="22"/>
+          <w:szCs w:val="22"/>
+        </w:rPr>
+        <w:t>nEUro</w:t>
+      </w:r>
+      <w:proofErr w:type="spellEnd"/>
     </w:p>
     <w:p>
       <w:pPr>
@@ -3694,7 +3834,7 @@
           <w:szCs w:val="22"/>
         </w:rPr>
         <w:drawing>
-          <wp:inline distT="0" distB="0" distL="0" distR="0" wp14:anchorId="09CC0387" wp14:editId="0967A54F">
+          <wp:inline distT="0" distB="0" distL="0" distR="0" wp14:anchorId="09CC0387" wp14:editId="01E1B230">
             <wp:extent cx="1145349" cy="335915"/>
             <wp:effectExtent l="0" t="0" r="0" b="6985"/>
             <wp:docPr id="179072618" name="Picture 1" descr="A signature on a white background&#10;&#10;AI-generated content may be incorrect."/>
@@ -3709,7 +3849,7 @@
                     <pic:cNvPicPr/>
                   </pic:nvPicPr>
                   <pic:blipFill>
-                    <a:blip r:embed="rId12" cstate="print">
+                    <a:blip r:embed="rId11" cstate="print">
                       <a:extLst>
                         <a:ext uri="{28A0092B-C50C-407E-A947-70E740481C1C}">
                           <a14:useLocalDpi xmlns:a14="http://schemas.microsoft.com/office/drawing/2010/main" val="0"/>
@@ -3874,7 +4014,25 @@
           <w:sz w:val="22"/>
           <w:szCs w:val="22"/>
         </w:rPr>
-        <w:t>Neurobiology Research Unit center manager</w:t>
+        <w:t xml:space="preserve">Neurobiology Research Unit </w:t>
+      </w:r>
+      <w:proofErr w:type="spellStart"/>
+      <w:r>
+        <w:rPr>
+          <w:rFonts w:asciiTheme="majorHAnsi" w:eastAsia="Calibri" w:hAnsiTheme="majorHAnsi" w:cstheme="majorHAnsi"/>
+          <w:sz w:val="22"/>
+          <w:szCs w:val="22"/>
+        </w:rPr>
+        <w:t>center</w:t>
+      </w:r>
+      <w:proofErr w:type="spellEnd"/>
+      <w:r>
+        <w:rPr>
+          <w:rFonts w:asciiTheme="majorHAnsi" w:eastAsia="Calibri" w:hAnsiTheme="majorHAnsi" w:cstheme="majorHAnsi"/>
+          <w:sz w:val="22"/>
+          <w:szCs w:val="22"/>
+        </w:rPr>
+        <w:t xml:space="preserve"> manager</w:t>
       </w:r>
     </w:p>
     <w:p>
@@ -4225,8 +4383,20 @@
           <w:u w:val="single"/>
         </w:rPr>
         <w:lastRenderedPageBreak/>
-        <w:t>SCHEDULE A - Details about Public-nEUro</w:t>
-      </w:r>
+        <w:t>SCHEDULE A - Details about Public-</w:t>
+      </w:r>
+      <w:proofErr w:type="spellStart"/>
+      <w:r>
+        <w:rPr>
+          <w:rFonts w:ascii="Calibri" w:eastAsia="Calibri" w:hAnsi="Calibri" w:cs="Calibri"/>
+          <w:b/>
+          <w:sz w:val="22"/>
+          <w:szCs w:val="22"/>
+          <w:u w:val="single"/>
+        </w:rPr>
+        <w:t>nEUro</w:t>
+      </w:r>
+      <w:proofErr w:type="spellEnd"/>
     </w:p>
     <w:p>
       <w:pPr>
@@ -4273,7 +4443,29 @@
           <w:szCs w:val="22"/>
           <w:highlight w:val="white"/>
         </w:rPr>
-        <w:t>The Public-nEUro platform provides a secured infrastructure and service enabling FAIR- and GDPR-compliant sharing of Institution Data between Institution and interested users.</w:t>
+        <w:t>The Public-</w:t>
+      </w:r>
+      <w:proofErr w:type="spellStart"/>
+      <w:r>
+        <w:rPr>
+          <w:rFonts w:ascii="Calibri" w:eastAsia="Calibri" w:hAnsi="Calibri" w:cs="Calibri"/>
+          <w:color w:val="222222"/>
+          <w:sz w:val="22"/>
+          <w:szCs w:val="22"/>
+          <w:highlight w:val="white"/>
+        </w:rPr>
+        <w:t>nEUro</w:t>
+      </w:r>
+      <w:proofErr w:type="spellEnd"/>
+      <w:r>
+        <w:rPr>
+          <w:rFonts w:ascii="Calibri" w:eastAsia="Calibri" w:hAnsi="Calibri" w:cs="Calibri"/>
+          <w:color w:val="222222"/>
+          <w:sz w:val="22"/>
+          <w:szCs w:val="22"/>
+          <w:highlight w:val="white"/>
+        </w:rPr>
+        <w:t xml:space="preserve"> platform provides a secured infrastructure and service enabling FAIR- and GDPR-compliant sharing of Institution Data between Institution and interested users.</w:t>
       </w:r>
     </w:p>
     <w:p>
@@ -4345,7 +4537,29 @@
           <w:szCs w:val="22"/>
           <w:highlight w:val="white"/>
         </w:rPr>
-        <w:t xml:space="preserve"> (data processor) who makes it available via the Public-nEUro platform. </w:t>
+        <w:t xml:space="preserve"> (data processor) who makes it available via the Public-</w:t>
+      </w:r>
+      <w:proofErr w:type="spellStart"/>
+      <w:r>
+        <w:rPr>
+          <w:rFonts w:ascii="Calibri" w:eastAsia="Calibri" w:hAnsi="Calibri" w:cs="Calibri"/>
+          <w:color w:val="222222"/>
+          <w:sz w:val="22"/>
+          <w:szCs w:val="22"/>
+          <w:highlight w:val="white"/>
+        </w:rPr>
+        <w:t>nEUro</w:t>
+      </w:r>
+      <w:proofErr w:type="spellEnd"/>
+      <w:r>
+        <w:rPr>
+          <w:rFonts w:ascii="Calibri" w:eastAsia="Calibri" w:hAnsi="Calibri" w:cs="Calibri"/>
+          <w:color w:val="222222"/>
+          <w:sz w:val="22"/>
+          <w:szCs w:val="22"/>
+          <w:highlight w:val="white"/>
+        </w:rPr>
+        <w:t xml:space="preserve"> platform. </w:t>
       </w:r>
       <w:r>
         <w:rPr>
@@ -4418,7 +4632,7 @@
                     <pic:cNvPicPr preferRelativeResize="0"/>
                   </pic:nvPicPr>
                   <pic:blipFill>
-                    <a:blip r:embed="rId13"/>
+                    <a:blip r:embed="rId12"/>
                     <a:srcRect/>
                     <a:stretch>
                       <a:fillRect/>
@@ -4462,18 +4676,52 @@
           <w:szCs w:val="22"/>
           <w:highlight w:val="white"/>
         </w:rPr>
-        <w:t xml:space="preserve">Institution deposits the Institution Data via a secured file transfer protocol (SFTP) to Public-nEUro. In the </w:t>
-      </w:r>
-      <w:r>
-        <w:rPr>
-          <w:rFonts w:ascii="Calibri" w:eastAsia="Calibri" w:hAnsi="Calibri" w:cs="Calibri"/>
-          <w:color w:val="222222"/>
-          <w:sz w:val="22"/>
-          <w:szCs w:val="22"/>
-          <w:highlight w:val="white"/>
-        </w:rPr>
-        <w:t>Public-nEUro</w:t>
-      </w:r>
+        <w:t>Institution deposits the Institution Data via a secured file transfer protocol (SFTP) to Public-</w:t>
+      </w:r>
+      <w:proofErr w:type="spellStart"/>
+      <w:r>
+        <w:rPr>
+          <w:rFonts w:ascii="Calibri" w:eastAsia="Calibri" w:hAnsi="Calibri" w:cs="Calibri"/>
+          <w:color w:val="222222"/>
+          <w:sz w:val="22"/>
+          <w:szCs w:val="22"/>
+          <w:highlight w:val="white"/>
+        </w:rPr>
+        <w:t>nEUro</w:t>
+      </w:r>
+      <w:proofErr w:type="spellEnd"/>
+      <w:r>
+        <w:rPr>
+          <w:rFonts w:ascii="Calibri" w:eastAsia="Calibri" w:hAnsi="Calibri" w:cs="Calibri"/>
+          <w:color w:val="222222"/>
+          <w:sz w:val="22"/>
+          <w:szCs w:val="22"/>
+          <w:highlight w:val="white"/>
+        </w:rPr>
+        <w:t xml:space="preserve">. In the </w:t>
+      </w:r>
+      <w:r>
+        <w:rPr>
+          <w:rFonts w:ascii="Calibri" w:eastAsia="Calibri" w:hAnsi="Calibri" w:cs="Calibri"/>
+          <w:color w:val="222222"/>
+          <w:sz w:val="22"/>
+          <w:szCs w:val="22"/>
+          <w:highlight w:val="white"/>
+        </w:rPr>
+        <w:t>Public-</w:t>
+      </w:r>
+      <w:proofErr w:type="spellStart"/>
+      <w:r>
+        <w:rPr>
+          <w:rFonts w:ascii="Calibri" w:eastAsia="Calibri" w:hAnsi="Calibri" w:cs="Calibri"/>
+          <w:color w:val="222222"/>
+          <w:sz w:val="22"/>
+          <w:szCs w:val="22"/>
+          <w:highlight w:val="white"/>
+        </w:rPr>
+        <w:t>nEUro</w:t>
+      </w:r>
+      <w:proofErr w:type="spellEnd"/>
       <w:r>
         <w:rPr>
           <w:rFonts w:ascii="Calibri" w:eastAsia="Calibri" w:hAnsi="Calibri" w:cs="Calibri"/>
@@ -4668,7 +4916,7 @@
         </w:rPr>
         <w:t xml:space="preserve"> </w:t>
       </w:r>
-      <w:hyperlink r:id="rId14" w:history="1">
+      <w:hyperlink r:id="rId13" w:history="1">
         <w:r>
           <w:rPr>
             <w:rStyle w:val="Hyperlink"/>
@@ -4690,6 +4938,7 @@
         </w:rPr>
         <w:t xml:space="preserve">), </w:t>
       </w:r>
+      <w:proofErr w:type="spellStart"/>
       <w:r>
         <w:rPr>
           <w:rFonts w:ascii="Calibri" w:eastAsia="Calibri" w:hAnsi="Calibri" w:cs="Calibri"/>
@@ -4699,6 +4948,7 @@
         </w:rPr>
         <w:t>OpenNeuro</w:t>
       </w:r>
+      <w:proofErr w:type="spellEnd"/>
       <w:r>
         <w:rPr>
           <w:rFonts w:ascii="Calibri" w:eastAsia="Calibri" w:hAnsi="Calibri" w:cs="Calibri"/>
@@ -4709,7 +4959,7 @@
         </w:rPr>
         <w:t xml:space="preserve"> (US-based repository, </w:t>
       </w:r>
-      <w:hyperlink r:id="rId15" w:history="1">
+      <w:hyperlink r:id="rId14" w:history="1">
         <w:r>
           <w:rPr>
             <w:rStyle w:val="Hyperlink"/>
@@ -4750,7 +5000,7 @@
         </w:rPr>
         <w:t xml:space="preserve"> (Canada-based repository and computational platform, </w:t>
       </w:r>
-      <w:hyperlink r:id="rId16" w:history="1">
+      <w:hyperlink r:id="rId15" w:history="1">
         <w:r>
           <w:rPr>
             <w:rStyle w:val="Hyperlink"/>
@@ -5027,7 +5277,29 @@
           <w:szCs w:val="22"/>
           <w:highlight w:val="white"/>
         </w:rPr>
-        <w:t>In any case, Institution must remove any personal identifiers from the Institution Data before upload to Public-nEUro. Should the uploaded Institution Data contain anatomical information, Institution may, but is not required to, perform defacing of the data (i.e., to remove any facial information).</w:t>
+        <w:t>In any case, Institution must remove any personal identifiers from the Institution Data before upload to Public-</w:t>
+      </w:r>
+      <w:proofErr w:type="spellStart"/>
+      <w:r>
+        <w:rPr>
+          <w:rFonts w:ascii="Calibri" w:eastAsia="Calibri" w:hAnsi="Calibri" w:cs="Calibri"/>
+          <w:color w:val="222222"/>
+          <w:sz w:val="22"/>
+          <w:szCs w:val="22"/>
+          <w:highlight w:val="white"/>
+        </w:rPr>
+        <w:t>nEUro</w:t>
+      </w:r>
+      <w:proofErr w:type="spellEnd"/>
+      <w:r>
+        <w:rPr>
+          <w:rFonts w:ascii="Calibri" w:eastAsia="Calibri" w:hAnsi="Calibri" w:cs="Calibri"/>
+          <w:color w:val="222222"/>
+          <w:sz w:val="22"/>
+          <w:szCs w:val="22"/>
+          <w:highlight w:val="white"/>
+        </w:rPr>
+        <w:t>. Should the uploaded Institution Data contain anatomical information, Institution may, but is not required to, perform defacing of the data (i.e., to remove any facial information).</w:t>
       </w:r>
     </w:p>
     <w:p>
@@ -5438,7 +5710,33 @@
           <w:highlight w:val="white"/>
           <w:u w:val="single"/>
         </w:rPr>
-        <w:t>Data upload to Public-nEUro and data curation:</w:t>
+        <w:t>Data upload to Public-</w:t>
+      </w:r>
+      <w:proofErr w:type="spellStart"/>
+      <w:r>
+        <w:rPr>
+          <w:rFonts w:ascii="Calibri" w:eastAsia="Calibri" w:hAnsi="Calibri" w:cs="Calibri"/>
+          <w:b/>
+          <w:color w:val="222222"/>
+          <w:sz w:val="22"/>
+          <w:szCs w:val="22"/>
+          <w:highlight w:val="white"/>
+          <w:u w:val="single"/>
+        </w:rPr>
+        <w:t>nEUro</w:t>
+      </w:r>
+      <w:proofErr w:type="spellEnd"/>
+      <w:r>
+        <w:rPr>
+          <w:rFonts w:ascii="Calibri" w:eastAsia="Calibri" w:hAnsi="Calibri" w:cs="Calibri"/>
+          <w:b/>
+          <w:color w:val="222222"/>
+          <w:sz w:val="22"/>
+          <w:szCs w:val="22"/>
+          <w:highlight w:val="white"/>
+          <w:u w:val="single"/>
+        </w:rPr>
+        <w:t xml:space="preserve"> and data curation:</w:t>
       </w:r>
     </w:p>
     <w:p>
@@ -5531,7 +5829,29 @@
           <w:szCs w:val="22"/>
           <w:highlight w:val="white"/>
         </w:rPr>
-        <w:t xml:space="preserve"> Public-nEUro. When Institution has performed the data upload, </w:t>
+        <w:t xml:space="preserve"> Public-</w:t>
+      </w:r>
+      <w:proofErr w:type="spellStart"/>
+      <w:r>
+        <w:rPr>
+          <w:rFonts w:ascii="Calibri" w:eastAsia="Calibri" w:hAnsi="Calibri" w:cs="Calibri"/>
+          <w:color w:val="222222"/>
+          <w:sz w:val="22"/>
+          <w:szCs w:val="22"/>
+          <w:highlight w:val="white"/>
+        </w:rPr>
+        <w:t>nEUro</w:t>
+      </w:r>
+      <w:proofErr w:type="spellEnd"/>
+      <w:r>
+        <w:rPr>
+          <w:rFonts w:ascii="Calibri" w:eastAsia="Calibri" w:hAnsi="Calibri" w:cs="Calibri"/>
+          <w:color w:val="222222"/>
+          <w:sz w:val="22"/>
+          <w:szCs w:val="22"/>
+          <w:highlight w:val="white"/>
+        </w:rPr>
+        <w:t xml:space="preserve">. When Institution has performed the data upload, </w:t>
       </w:r>
       <w:r>
         <w:rPr>
@@ -5721,7 +6041,29 @@
           <w:szCs w:val="22"/>
           <w:highlight w:val="white"/>
         </w:rPr>
-        <w:t xml:space="preserve">metadata enhancement (e.g. metadata schemas for cross-referencing with OpenNeuro), </w:t>
+        <w:t xml:space="preserve">metadata enhancement (e.g. metadata schemas for cross-referencing with </w:t>
+      </w:r>
+      <w:proofErr w:type="spellStart"/>
+      <w:r>
+        <w:rPr>
+          <w:rFonts w:ascii="Calibri" w:eastAsia="Calibri" w:hAnsi="Calibri" w:cs="Calibri"/>
+          <w:color w:val="222222"/>
+          <w:sz w:val="22"/>
+          <w:szCs w:val="22"/>
+          <w:highlight w:val="white"/>
+        </w:rPr>
+        <w:t>OpenNeuro</w:t>
+      </w:r>
+      <w:proofErr w:type="spellEnd"/>
+      <w:r>
+        <w:rPr>
+          <w:rFonts w:ascii="Calibri" w:eastAsia="Calibri" w:hAnsi="Calibri" w:cs="Calibri"/>
+          <w:color w:val="222222"/>
+          <w:sz w:val="22"/>
+          <w:szCs w:val="22"/>
+          <w:highlight w:val="white"/>
+        </w:rPr>
+        <w:t xml:space="preserve">), </w:t>
       </w:r>
       <w:r>
         <w:rPr>
@@ -5839,8 +6181,20 @@
           <w:szCs w:val="22"/>
           <w:highlight w:val="white"/>
         </w:rPr>
-        <w:t>Public-nEUro</w:t>
-      </w:r>
+        <w:t>Public-</w:t>
+      </w:r>
+      <w:proofErr w:type="spellStart"/>
+      <w:r>
+        <w:rPr>
+          <w:rFonts w:ascii="Calibri" w:eastAsia="Calibri" w:hAnsi="Calibri" w:cs="Calibri"/>
+          <w:color w:val="222222"/>
+          <w:sz w:val="22"/>
+          <w:szCs w:val="22"/>
+          <w:highlight w:val="white"/>
+        </w:rPr>
+        <w:t>nEUro</w:t>
+      </w:r>
+      <w:proofErr w:type="spellEnd"/>
       <w:r>
         <w:rPr>
           <w:rFonts w:ascii="Calibri" w:eastAsia="Calibri" w:hAnsi="Calibri" w:cs="Calibri"/>
@@ -5922,6 +6276,7 @@
           <w:szCs w:val="22"/>
         </w:rPr>
       </w:pPr>
+      <w:proofErr w:type="spellStart"/>
       <w:r>
         <w:rPr>
           <w:rFonts w:ascii="Calibri" w:eastAsia="Calibri" w:hAnsi="Calibri" w:cs="Calibri"/>
@@ -5932,6 +6287,7 @@
         </w:rPr>
         <w:t>Dataset_name</w:t>
       </w:r>
+      <w:proofErr w:type="spellEnd"/>
     </w:p>
     <w:p>
       <w:pPr>
@@ -6349,6 +6705,195 @@
         <w:contextualSpacing/>
         <w:rPr>
           <w:rFonts w:ascii="Calibri" w:eastAsia="Calibri" w:hAnsi="Calibri" w:cs="Calibri"/>
+          <w:bCs/>
+          <w:i/>
+          <w:iCs/>
+          <w:sz w:val="22"/>
+          <w:szCs w:val="22"/>
+        </w:rPr>
+      </w:pPr>
+      <w:r>
+        <w:rPr>
+          <w:rFonts w:ascii="Calibri" w:eastAsia="Calibri" w:hAnsi="Calibri" w:cs="Calibri"/>
+          <w:b/>
+          <w:sz w:val="22"/>
+          <w:szCs w:val="22"/>
+        </w:rPr>
+        <w:t xml:space="preserve">Institution allows NRU to perform the following activities within limitations defined in section 5 </w:t>
+      </w:r>
+      <w:r>
+        <w:rPr>
+          <w:rFonts w:ascii="Calibri" w:eastAsia="Calibri" w:hAnsi="Calibri" w:cs="Calibri"/>
+          <w:bCs/>
+          <w:i/>
+          <w:iCs/>
+          <w:sz w:val="22"/>
+          <w:szCs w:val="22"/>
+        </w:rPr>
+        <w:t>(academic publications and presentations) and section 8 (intellectual property):</w:t>
+      </w:r>
+    </w:p>
+    <w:p>
+      <w:pPr>
+        <w:pBdr>
+          <w:top w:val="nil"/>
+          <w:left w:val="nil"/>
+          <w:bottom w:val="nil"/>
+          <w:right w:val="nil"/>
+          <w:between w:val="nil"/>
+        </w:pBdr>
+        <w:spacing w:line="240" w:lineRule="auto"/>
+        <w:ind w:leftChars="0" w:left="0" w:firstLineChars="0" w:firstLine="284"/>
+        <w:contextualSpacing/>
+        <w:rPr>
+          <w:rFonts w:ascii="Calibri" w:eastAsia="Calibri" w:hAnsi="Calibri" w:cs="Calibri"/>
+          <w:bCs/>
+          <w:sz w:val="22"/>
+          <w:szCs w:val="22"/>
+        </w:rPr>
+      </w:pPr>
+      <w:sdt>
+        <w:sdtPr>
+          <w:rPr>
+            <w:rFonts w:ascii="Segoe UI Symbol" w:eastAsia="Calibri" w:hAnsi="Segoe UI Symbol" w:cs="Segoe UI Symbol"/>
+            <w:sz w:val="22"/>
+            <w:szCs w:val="22"/>
+          </w:rPr>
+          <w:id w:val="-600869993"/>
+          <w14:checkbox>
+            <w14:checked w14:val="1"/>
+            <w14:checkedState w14:val="2612" w14:font="MS Gothic"/>
+            <w14:uncheckedState w14:val="2610" w14:font="MS Gothic"/>
+          </w14:checkbox>
+        </w:sdtPr>
+        <w:sdtContent>
+          <w:r>
+            <w:rPr>
+              <w:rFonts w:ascii="MS Gothic" w:eastAsia="MS Gothic" w:hAnsi="MS Gothic" w:cs="Segoe UI Symbol" w:hint="eastAsia"/>
+              <w:sz w:val="22"/>
+              <w:szCs w:val="22"/>
+            </w:rPr>
+            <w:t>☒</w:t>
+          </w:r>
+        </w:sdtContent>
+      </w:sdt>
+      <w:r>
+        <w:rPr>
+          <w:rFonts w:ascii="Segoe UI Symbol" w:eastAsia="Calibri" w:hAnsi="Segoe UI Symbol" w:cs="Segoe UI Symbol"/>
+          <w:sz w:val="22"/>
+          <w:szCs w:val="22"/>
+        </w:rPr>
+        <w:t xml:space="preserve"> </w:t>
+      </w:r>
+      <w:r>
+        <w:rPr>
+          <w:rFonts w:ascii="Calibri" w:eastAsia="Calibri" w:hAnsi="Calibri" w:cs="Calibri"/>
+          <w:bCs/>
+          <w:sz w:val="22"/>
+          <w:szCs w:val="22"/>
+        </w:rPr>
+        <w:t>Quality control and publication of those results on the PublicnEUro website</w:t>
+      </w:r>
+    </w:p>
+    <w:p>
+      <w:pPr>
+        <w:pBdr>
+          <w:top w:val="nil"/>
+          <w:left w:val="nil"/>
+          <w:bottom w:val="nil"/>
+          <w:right w:val="nil"/>
+          <w:between w:val="nil"/>
+        </w:pBdr>
+        <w:spacing w:line="240" w:lineRule="auto"/>
+        <w:ind w:leftChars="0" w:left="0" w:firstLineChars="0" w:firstLine="284"/>
+        <w:contextualSpacing/>
+        <w:rPr>
+          <w:rFonts w:ascii="Calibri" w:eastAsia="Calibri" w:hAnsi="Calibri" w:cs="Calibri"/>
+          <w:bCs/>
+          <w:sz w:val="22"/>
+          <w:szCs w:val="22"/>
+        </w:rPr>
+      </w:pPr>
+      <w:sdt>
+        <w:sdtPr>
+          <w:rPr>
+            <w:rFonts w:ascii="Segoe UI Symbol" w:eastAsia="Calibri" w:hAnsi="Segoe UI Symbol" w:cs="Segoe UI Symbol"/>
+            <w:bCs/>
+            <w:sz w:val="22"/>
+            <w:szCs w:val="22"/>
+          </w:rPr>
+          <w:id w:val="-1100407699"/>
+          <w14:checkbox>
+            <w14:checked w14:val="1"/>
+            <w14:checkedState w14:val="2612" w14:font="MS Gothic"/>
+            <w14:uncheckedState w14:val="2610" w14:font="MS Gothic"/>
+          </w14:checkbox>
+        </w:sdtPr>
+        <w:sdtContent>
+          <w:r>
+            <w:rPr>
+              <w:rFonts w:ascii="MS Gothic" w:eastAsia="MS Gothic" w:hAnsi="MS Gothic" w:cs="Segoe UI Symbol" w:hint="eastAsia"/>
+              <w:bCs/>
+              <w:sz w:val="22"/>
+              <w:szCs w:val="22"/>
+            </w:rPr>
+            <w:t>☒</w:t>
+          </w:r>
+        </w:sdtContent>
+      </w:sdt>
+      <w:r>
+        <w:rPr>
+          <w:rFonts w:ascii="Segoe UI Symbol" w:eastAsia="Calibri" w:hAnsi="Segoe UI Symbol" w:cs="Segoe UI Symbol"/>
+          <w:bCs/>
+          <w:sz w:val="22"/>
+          <w:szCs w:val="22"/>
+        </w:rPr>
+        <w:t xml:space="preserve"> </w:t>
+      </w:r>
+      <w:r>
+        <w:rPr>
+          <w:rFonts w:ascii="Calibri" w:eastAsia="Calibri" w:hAnsi="Calibri" w:cs="Calibri"/>
+          <w:bCs/>
+          <w:sz w:val="22"/>
+          <w:szCs w:val="22"/>
+        </w:rPr>
+        <w:t>Meta-analyses and creation of brain imaging atlases</w:t>
+      </w:r>
+    </w:p>
+    <w:p>
+      <w:pPr>
+        <w:pBdr>
+          <w:top w:val="nil"/>
+          <w:left w:val="nil"/>
+          <w:bottom w:val="nil"/>
+          <w:right w:val="nil"/>
+          <w:between w:val="nil"/>
+        </w:pBdr>
+        <w:spacing w:line="240" w:lineRule="auto"/>
+        <w:ind w:leftChars="0" w:left="0" w:firstLineChars="0" w:firstLine="284"/>
+        <w:contextualSpacing/>
+        <w:rPr>
+          <w:rFonts w:ascii="Calibri" w:eastAsia="Calibri" w:hAnsi="Calibri" w:cs="Calibri"/>
+          <w:b/>
+          <w:sz w:val="22"/>
+          <w:szCs w:val="22"/>
+        </w:rPr>
+      </w:pPr>
+    </w:p>
+    <w:p>
+      <w:pPr>
+        <w:pBdr>
+          <w:top w:val="nil"/>
+          <w:left w:val="nil"/>
+          <w:bottom w:val="nil"/>
+          <w:right w:val="nil"/>
+          <w:between w:val="nil"/>
+        </w:pBdr>
+        <w:spacing w:line="240" w:lineRule="auto"/>
+        <w:ind w:leftChars="0" w:left="0" w:firstLineChars="0" w:firstLine="284"/>
+        <w:contextualSpacing/>
+        <w:rPr>
+          <w:rFonts w:ascii="Calibri" w:eastAsia="Calibri" w:hAnsi="Calibri" w:cs="Calibri"/>
           <w:sz w:val="22"/>
           <w:szCs w:val="22"/>
         </w:rPr>
@@ -6514,7 +7059,29 @@
           <w:szCs w:val="22"/>
           <w:highlight w:val="white"/>
         </w:rPr>
-        <w:t xml:space="preserve">Institution requires to approve each user DUA and SCC signature before PublicnEuro gives access to the data (controller to processor SCC). </w:t>
+        <w:t xml:space="preserve">Institution requires to approve each user DUA and SCC signature before </w:t>
+      </w:r>
+      <w:proofErr w:type="spellStart"/>
+      <w:r>
+        <w:rPr>
+          <w:rFonts w:ascii="Calibri" w:eastAsia="Calibri" w:hAnsi="Calibri" w:cs="Calibri"/>
+          <w:color w:val="222222"/>
+          <w:sz w:val="22"/>
+          <w:szCs w:val="22"/>
+          <w:highlight w:val="white"/>
+        </w:rPr>
+        <w:t>PublicnEuro</w:t>
+      </w:r>
+      <w:proofErr w:type="spellEnd"/>
+      <w:r>
+        <w:rPr>
+          <w:rFonts w:ascii="Calibri" w:eastAsia="Calibri" w:hAnsi="Calibri" w:cs="Calibri"/>
+          <w:color w:val="222222"/>
+          <w:sz w:val="22"/>
+          <w:szCs w:val="22"/>
+          <w:highlight w:val="white"/>
+        </w:rPr>
+        <w:t xml:space="preserve"> gives access to the data (controller to processor SCC). </w:t>
       </w:r>
     </w:p>
     <w:p>
@@ -6718,7 +7285,27 @@
           <w:sz w:val="22"/>
           <w:szCs w:val="22"/>
         </w:rPr>
-        <w:t xml:space="preserve">of PublicNeuro </w:t>
+        <w:t xml:space="preserve">of </w:t>
+      </w:r>
+      <w:proofErr w:type="spellStart"/>
+      <w:r>
+        <w:rPr>
+          <w:rFonts w:ascii="Calibri" w:eastAsia="Calibri" w:hAnsi="Calibri" w:cs="Calibri"/>
+          <w:color w:val="222222"/>
+          <w:sz w:val="22"/>
+          <w:szCs w:val="22"/>
+        </w:rPr>
+        <w:t>PublicNeuro</w:t>
+      </w:r>
+      <w:proofErr w:type="spellEnd"/>
+      <w:r>
+        <w:rPr>
+          <w:rFonts w:ascii="Calibri" w:eastAsia="Calibri" w:hAnsi="Calibri" w:cs="Calibri"/>
+          <w:color w:val="222222"/>
+          <w:sz w:val="22"/>
+          <w:szCs w:val="22"/>
+        </w:rPr>
+        <w:t xml:space="preserve"> </w:t>
       </w:r>
       <w:r>
         <w:rPr>
@@ -6824,7 +7411,6 @@
           <w:szCs w:val="22"/>
           <w:highlight w:val="white"/>
         </w:rPr>
-        <w:lastRenderedPageBreak/>
         <w:t>Depending on the choices made by Institution below, the released Institution Data will be privately, publicly or openly hosted, and group metadata shared publicly. Public sharing means that an open public record of available data will be published and searchable on the web or other neuroimaging repository, while data access remains controlled.</w:t>
       </w:r>
     </w:p>
@@ -7467,7 +8053,47 @@
           <w:sz w:val="22"/>
           <w:szCs w:val="22"/>
         </w:rPr>
-        <w:t xml:space="preserve"> new user must register on Public-nEUro giving a password for future login. In conformity with best practices, any new access will also require a One-Time Password generated by a third party thus minimizing risks of giving access to an unidentified third person. All new user registrations will be manually handled by a member of the Public-nEUro team, who will ensure that the provided user information is valid. First upon manual approval of the new user, the new user will have a valid status and get access to </w:t>
+        <w:t xml:space="preserve"> new user must register on Public-</w:t>
+      </w:r>
+      <w:proofErr w:type="spellStart"/>
+      <w:r>
+        <w:rPr>
+          <w:rFonts w:ascii="Calibri" w:eastAsia="Calibri" w:hAnsi="Calibri" w:cs="Calibri"/>
+          <w:color w:val="000000"/>
+          <w:sz w:val="22"/>
+          <w:szCs w:val="22"/>
+        </w:rPr>
+        <w:t>nEUro</w:t>
+      </w:r>
+      <w:proofErr w:type="spellEnd"/>
+      <w:r>
+        <w:rPr>
+          <w:rFonts w:ascii="Calibri" w:eastAsia="Calibri" w:hAnsi="Calibri" w:cs="Calibri"/>
+          <w:color w:val="000000"/>
+          <w:sz w:val="22"/>
+          <w:szCs w:val="22"/>
+        </w:rPr>
+        <w:t xml:space="preserve"> giving a password for future login. In conformity with best practices, any new access will also require a One-Time Password generated by a third party thus minimizing risks of giving access to an unidentified third person. All new user registrations will be manually handled by a member of the Public-</w:t>
+      </w:r>
+      <w:proofErr w:type="spellStart"/>
+      <w:r>
+        <w:rPr>
+          <w:rFonts w:ascii="Calibri" w:eastAsia="Calibri" w:hAnsi="Calibri" w:cs="Calibri"/>
+          <w:color w:val="000000"/>
+          <w:sz w:val="22"/>
+          <w:szCs w:val="22"/>
+        </w:rPr>
+        <w:t>nEUro</w:t>
+      </w:r>
+      <w:proofErr w:type="spellEnd"/>
+      <w:r>
+        <w:rPr>
+          <w:rFonts w:ascii="Calibri" w:eastAsia="Calibri" w:hAnsi="Calibri" w:cs="Calibri"/>
+          <w:color w:val="000000"/>
+          <w:sz w:val="22"/>
+          <w:szCs w:val="22"/>
+        </w:rPr>
+        <w:t xml:space="preserve"> team, who will ensure that the provided user information is valid. First upon manual approval of the new user, the new user will have a valid status and get access to </w:t>
       </w:r>
       <w:r>
         <w:rPr>
@@ -7487,6 +8113,7 @@
         </w:rPr>
         <w:t>-</w:t>
       </w:r>
+      <w:proofErr w:type="spellStart"/>
       <w:r>
         <w:rPr>
           <w:rFonts w:ascii="Calibri" w:eastAsia="Calibri" w:hAnsi="Calibri" w:cs="Calibri"/>
@@ -7496,6 +8123,7 @@
         </w:rPr>
         <w:t>nEUro</w:t>
       </w:r>
+      <w:proofErr w:type="spellEnd"/>
       <w:r>
         <w:rPr>
           <w:rFonts w:ascii="Calibri" w:eastAsia="Calibri" w:hAnsi="Calibri" w:cs="Calibri"/>
@@ -7581,7 +8209,27 @@
           <w:sz w:val="22"/>
           <w:szCs w:val="22"/>
         </w:rPr>
-        <w:t xml:space="preserve"> A general possible risk associated with sharing pseudonymized data is re-identification. Since users interested in the released Institution Data are requested to register with Public-nEUro and to sign the DUA associated with the Institution Data, the DUA must state that users are not allowed to attempt to re-identify participants. The risk of re-identification and of potential harm is low since a high level of expertise is required to analyse and interpret biomedical and imaging datasets. Institution has the responsibility for the DUA being lawful, while </w:t>
+        <w:t xml:space="preserve"> A general possible risk associated with sharing pseudonymized data is re-identification. Since users interested in the released Institution Data are requested to register with Public-</w:t>
+      </w:r>
+      <w:proofErr w:type="spellStart"/>
+      <w:r>
+        <w:rPr>
+          <w:rFonts w:ascii="Calibri" w:eastAsia="Calibri" w:hAnsi="Calibri" w:cs="Calibri"/>
+          <w:color w:val="000000"/>
+          <w:sz w:val="22"/>
+          <w:szCs w:val="22"/>
+        </w:rPr>
+        <w:t>nEUro</w:t>
+      </w:r>
+      <w:proofErr w:type="spellEnd"/>
+      <w:r>
+        <w:rPr>
+          <w:rFonts w:ascii="Calibri" w:eastAsia="Calibri" w:hAnsi="Calibri" w:cs="Calibri"/>
+          <w:color w:val="000000"/>
+          <w:sz w:val="22"/>
+          <w:szCs w:val="22"/>
+        </w:rPr>
+        <w:t xml:space="preserve"> and to sign the DUA associated with the Institution Data, the DUA must state that users are not allowed to attempt to re-identify participants. The risk of re-identification and of potential harm is low since a high level of expertise is required to analyse and interpret biomedical and imaging datasets. Institution has the responsibility for the DUA being lawful, while </w:t>
       </w:r>
       <w:r>
         <w:rPr>
@@ -7637,14 +8285,25 @@
         </w:rPr>
         <w:t>-</w:t>
       </w:r>
-      <w:r>
-        <w:rPr>
-          <w:rFonts w:ascii="Calibri" w:eastAsia="Calibri" w:hAnsi="Calibri" w:cs="Calibri"/>
-          <w:color w:val="000000"/>
-          <w:sz w:val="22"/>
-          <w:szCs w:val="22"/>
-        </w:rPr>
-        <w:t xml:space="preserve">nEUro </w:t>
+      <w:proofErr w:type="spellStart"/>
+      <w:r>
+        <w:rPr>
+          <w:rFonts w:ascii="Calibri" w:eastAsia="Calibri" w:hAnsi="Calibri" w:cs="Calibri"/>
+          <w:color w:val="000000"/>
+          <w:sz w:val="22"/>
+          <w:szCs w:val="22"/>
+        </w:rPr>
+        <w:t>nEUro</w:t>
+      </w:r>
+      <w:proofErr w:type="spellEnd"/>
+      <w:r>
+        <w:rPr>
+          <w:rFonts w:ascii="Calibri" w:eastAsia="Calibri" w:hAnsi="Calibri" w:cs="Calibri"/>
+          <w:color w:val="000000"/>
+          <w:sz w:val="22"/>
+          <w:szCs w:val="22"/>
+        </w:rPr>
+        <w:t xml:space="preserve"> </w:t>
       </w:r>
       <w:r>
         <w:rPr>
@@ -7705,6 +8364,7 @@
           <w:szCs w:val="22"/>
           <w:u w:val="single"/>
         </w:rPr>
+        <w:lastRenderedPageBreak/>
         <w:t>Storage and access:</w:t>
       </w:r>
       <w:r>
@@ -7761,7 +8421,7 @@
         </w:rPr>
         <w:t>Computerome (</w:t>
       </w:r>
-      <w:hyperlink r:id="rId17" w:history="1">
+      <w:hyperlink r:id="rId16" w:history="1">
         <w:r>
           <w:rPr>
             <w:rStyle w:val="Hyperlink"/>
@@ -7779,7 +8439,27 @@
           <w:sz w:val="22"/>
           <w:szCs w:val="22"/>
         </w:rPr>
-        <w:t>), the Danish National life science supercomputing center. Computerome</w:t>
+        <w:t xml:space="preserve">), the Danish National life science supercomputing </w:t>
+      </w:r>
+      <w:proofErr w:type="spellStart"/>
+      <w:r>
+        <w:rPr>
+          <w:rFonts w:ascii="Calibri" w:eastAsia="Calibri" w:hAnsi="Calibri" w:cs="Calibri"/>
+          <w:color w:val="000000"/>
+          <w:sz w:val="22"/>
+          <w:szCs w:val="22"/>
+        </w:rPr>
+        <w:t>center</w:t>
+      </w:r>
+      <w:proofErr w:type="spellEnd"/>
+      <w:r>
+        <w:rPr>
+          <w:rFonts w:ascii="Calibri" w:eastAsia="Calibri" w:hAnsi="Calibri" w:cs="Calibri"/>
+          <w:color w:val="000000"/>
+          <w:sz w:val="22"/>
+          <w:szCs w:val="22"/>
+        </w:rPr>
+        <w:t>. Computerome</w:t>
       </w:r>
       <w:r>
         <w:rPr>
@@ -7851,17 +8531,7 @@
           <w:sz w:val="22"/>
           <w:szCs w:val="22"/>
         </w:rPr>
-        <w:t>and geo-</w:t>
-      </w:r>
-      <w:r>
-        <w:rPr>
-          <w:rFonts w:ascii="Calibri" w:eastAsia="Calibri" w:hAnsi="Calibri" w:cs="Calibri"/>
-          <w:color w:val="000000"/>
-          <w:sz w:val="22"/>
-          <w:szCs w:val="22"/>
-        </w:rPr>
-        <w:lastRenderedPageBreak/>
-        <w:t>redundant back-ups</w:t>
+        <w:t>and geo-redundant back-ups</w:t>
       </w:r>
       <w:r>
         <w:rPr>
@@ -7899,7 +8569,7 @@
         </w:rPr>
         <w:t xml:space="preserve"> (see </w:t>
       </w:r>
-      <w:hyperlink r:id="rId18" w:history="1">
+      <w:hyperlink r:id="rId17" w:history="1">
         <w:r>
           <w:rPr>
             <w:rStyle w:val="Hyperlink"/>
@@ -8036,6 +8706,154 @@
     </w:p>
     <w:p>
       <w:pPr>
+        <w:spacing w:line="240" w:lineRule="auto"/>
+        <w:ind w:leftChars="0" w:left="0" w:firstLineChars="0" w:firstLine="284"/>
+        <w:contextualSpacing/>
+        <w:rPr>
+          <w:rFonts w:ascii="Calibri" w:eastAsia="Calibri" w:hAnsi="Calibri" w:cs="Calibri"/>
+          <w:color w:val="222222"/>
+          <w:sz w:val="22"/>
+          <w:szCs w:val="22"/>
+        </w:rPr>
+      </w:pPr>
+      <w:r>
+        <w:rPr>
+          <w:rFonts w:ascii="Calibri" w:eastAsia="Calibri" w:hAnsi="Calibri" w:cs="Calibri"/>
+          <w:color w:val="222222"/>
+          <w:sz w:val="22"/>
+          <w:szCs w:val="22"/>
+        </w:rPr>
+        <w:t xml:space="preserve">If </w:t>
+      </w:r>
+      <w:r>
+        <w:rPr>
+          <w:rFonts w:ascii="Calibri" w:eastAsia="Calibri" w:hAnsi="Calibri" w:cs="Calibri"/>
+          <w:color w:val="222222"/>
+          <w:sz w:val="22"/>
+          <w:szCs w:val="22"/>
+        </w:rPr>
+        <w:t>I</w:t>
+      </w:r>
+      <w:r>
+        <w:rPr>
+          <w:rFonts w:ascii="Calibri" w:eastAsia="Calibri" w:hAnsi="Calibri" w:cs="Calibri"/>
+          <w:color w:val="222222"/>
+          <w:sz w:val="22"/>
+          <w:szCs w:val="22"/>
+        </w:rPr>
+        <w:t xml:space="preserve">nstitution agrees that NRU is allowed to process the Institution Data for </w:t>
+      </w:r>
+      <w:r>
+        <w:rPr>
+          <w:rFonts w:ascii="Calibri" w:eastAsia="Calibri" w:hAnsi="Calibri" w:cs="Calibri"/>
+          <w:color w:val="222222"/>
+          <w:sz w:val="22"/>
+          <w:szCs w:val="22"/>
+        </w:rPr>
+        <w:t xml:space="preserve">Quality control and/or </w:t>
+      </w:r>
+      <w:r>
+        <w:rPr>
+          <w:rFonts w:ascii="Calibri" w:eastAsia="Calibri" w:hAnsi="Calibri" w:cs="Calibri"/>
+          <w:color w:val="222222"/>
+          <w:sz w:val="22"/>
+          <w:szCs w:val="22"/>
+        </w:rPr>
+        <w:t xml:space="preserve">Meta-analyses and the creation of brain imaging atlases, </w:t>
+      </w:r>
+      <w:r>
+        <w:rPr>
+          <w:rFonts w:ascii="Calibri" w:eastAsia="Calibri" w:hAnsi="Calibri" w:cs="Calibri"/>
+          <w:color w:val="222222"/>
+          <w:sz w:val="22"/>
+          <w:szCs w:val="22"/>
+        </w:rPr>
+        <w:t>Institution</w:t>
+      </w:r>
+      <w:r>
+        <w:rPr>
+          <w:rFonts w:ascii="Calibri" w:eastAsia="Calibri" w:hAnsi="Calibri" w:cs="Calibri"/>
+          <w:color w:val="222222"/>
+          <w:sz w:val="22"/>
+          <w:szCs w:val="22"/>
+        </w:rPr>
+        <w:t xml:space="preserve"> also agrees for the Data to be transferred onto NRU</w:t>
+      </w:r>
+      <w:r>
+        <w:rPr>
+          <w:rFonts w:ascii="Calibri" w:eastAsia="Calibri" w:hAnsi="Calibri" w:cs="Calibri"/>
+          <w:color w:val="222222"/>
+          <w:sz w:val="22"/>
+          <w:szCs w:val="22"/>
+        </w:rPr>
+        <w:t>’s</w:t>
+      </w:r>
+      <w:r>
+        <w:rPr>
+          <w:rFonts w:ascii="Calibri" w:eastAsia="Calibri" w:hAnsi="Calibri" w:cs="Calibri"/>
+          <w:color w:val="222222"/>
+          <w:sz w:val="22"/>
+          <w:szCs w:val="22"/>
+        </w:rPr>
+        <w:t xml:space="preserve"> secured server</w:t>
+      </w:r>
+      <w:r>
+        <w:rPr>
+          <w:rFonts w:ascii="Calibri" w:eastAsia="Calibri" w:hAnsi="Calibri" w:cs="Calibri"/>
+          <w:color w:val="222222"/>
+          <w:sz w:val="22"/>
+          <w:szCs w:val="22"/>
+        </w:rPr>
+        <w:t>s</w:t>
+      </w:r>
+      <w:r>
+        <w:rPr>
+          <w:rFonts w:ascii="Calibri" w:eastAsia="Calibri" w:hAnsi="Calibri" w:cs="Calibri"/>
+          <w:color w:val="222222"/>
+          <w:sz w:val="22"/>
+          <w:szCs w:val="22"/>
+        </w:rPr>
+        <w:t xml:space="preserve"> (with access restricted to identified person</w:t>
+      </w:r>
+      <w:r>
+        <w:rPr>
+          <w:rFonts w:ascii="Calibri" w:eastAsia="Calibri" w:hAnsi="Calibri" w:cs="Calibri"/>
+          <w:color w:val="222222"/>
+          <w:sz w:val="22"/>
+          <w:szCs w:val="22"/>
+        </w:rPr>
+        <w:t>n</w:t>
+      </w:r>
+      <w:r>
+        <w:rPr>
+          <w:rFonts w:ascii="Calibri" w:eastAsia="Calibri" w:hAnsi="Calibri" w:cs="Calibri"/>
+          <w:color w:val="222222"/>
+          <w:sz w:val="22"/>
+          <w:szCs w:val="22"/>
+        </w:rPr>
+        <w:t xml:space="preserve">el), to perform such analyses. Examples of such analyses include, but are not limited to, </w:t>
+      </w:r>
+      <w:r>
+        <w:rPr>
+          <w:rFonts w:ascii="Calibri" w:eastAsia="Calibri" w:hAnsi="Calibri" w:cs="Calibri"/>
+          <w:color w:val="222222"/>
+          <w:sz w:val="22"/>
+          <w:szCs w:val="22"/>
+        </w:rPr>
+        <w:t>computing signal-to-noise ratios, motion between images, average structural or tissue images, average molecular densities, time activity curves in regions of interest, and group-level</w:t>
+      </w:r>
+      <w:r>
+        <w:rPr>
+          <w:rFonts w:ascii="Calibri" w:eastAsia="Calibri" w:hAnsi="Calibri" w:cs="Calibri"/>
+          <w:color w:val="222222"/>
+          <w:sz w:val="22"/>
+          <w:szCs w:val="22"/>
+        </w:rPr>
+        <w:t xml:space="preserve"> covariance/connectivity matrices. </w:t>
+      </w:r>
+    </w:p>
+    <w:p>
+      <w:pPr>
         <w:pBdr>
           <w:top w:val="nil"/>
           <w:left w:val="nil"/>
@@ -8044,105 +8862,15 @@
           <w:between w:val="nil"/>
         </w:pBdr>
         <w:spacing w:line="240" w:lineRule="auto"/>
-        <w:ind w:leftChars="0" w:left="284" w:firstLineChars="0" w:firstLine="0"/>
-        <w:contextualSpacing/>
-        <w:rPr>
-          <w:rFonts w:ascii="Calibri" w:eastAsia="Calibri" w:hAnsi="Calibri" w:cs="Calibri"/>
-          <w:color w:val="222222"/>
-          <w:sz w:val="22"/>
-          <w:szCs w:val="22"/>
-        </w:rPr>
-      </w:pPr>
-      <w:r>
-        <w:rPr>
-          <w:rFonts w:ascii="Calibri" w:eastAsia="Calibri" w:hAnsi="Calibri" w:cs="Calibri"/>
-          <w:color w:val="222222"/>
-          <w:sz w:val="22"/>
-          <w:szCs w:val="22"/>
-          <w:highlight w:val="white"/>
-        </w:rPr>
-        <w:t xml:space="preserve">Institution agrees that, except in the case of private hosting, </w:t>
-      </w:r>
-      <w:r>
-        <w:rPr>
-          <w:rFonts w:ascii="Calibri" w:eastAsia="Calibri" w:hAnsi="Calibri" w:cs="Calibri"/>
-          <w:color w:val="222222"/>
-          <w:sz w:val="22"/>
-          <w:szCs w:val="22"/>
-          <w:highlight w:val="white"/>
-        </w:rPr>
-        <w:t>NRU</w:t>
-      </w:r>
-      <w:r>
-        <w:rPr>
-          <w:rFonts w:ascii="Calibri" w:eastAsia="Calibri" w:hAnsi="Calibri" w:cs="Calibri"/>
-          <w:color w:val="222222"/>
-          <w:sz w:val="22"/>
-          <w:szCs w:val="22"/>
-          <w:highlight w:val="white"/>
-        </w:rPr>
-        <w:t xml:space="preserve"> is allowed to process the Institution Data on their own behalf for atlasing purposes, i.e., the activity of analysing aggregated Institution Datasets in order to create reference images</w:t>
-      </w:r>
-      <w:r>
-        <w:rPr>
-          <w:rFonts w:ascii="Calibri" w:eastAsia="Calibri" w:hAnsi="Calibri" w:cs="Calibri"/>
-          <w:color w:val="222222"/>
-          <w:sz w:val="22"/>
-          <w:szCs w:val="22"/>
-          <w:highlight w:val="white"/>
-        </w:rPr>
-        <w:t xml:space="preserve"> (section 5.2)</w:t>
-      </w:r>
-      <w:r>
-        <w:rPr>
-          <w:rFonts w:ascii="Calibri" w:eastAsia="Calibri" w:hAnsi="Calibri" w:cs="Calibri"/>
-          <w:color w:val="222222"/>
-          <w:sz w:val="22"/>
-          <w:szCs w:val="22"/>
-          <w:highlight w:val="white"/>
-        </w:rPr>
-        <w:t xml:space="preserve">. Institution Data transferred to Public-nEUro can therefore be analysed and results merged with datasets from other institutions in order to create or improve brain atlases which might be published and shared openly (under an appropriate CCBY license). Examples of such atlases include, but are not limited to, average structural or tissue images, average molecular densities, time activity curves in regions of interest, group level covariance/connectivity matrices. In any case, only aggregated data from multiple Institutions will be used. Data analyses will take place on secured (behind firewalls with access control) private servers hosted by </w:t>
-      </w:r>
-      <w:r>
-        <w:rPr>
-          <w:rFonts w:ascii="Calibri" w:eastAsia="Calibri" w:hAnsi="Calibri" w:cs="Calibri"/>
-          <w:color w:val="222222"/>
-          <w:sz w:val="22"/>
-          <w:szCs w:val="22"/>
-          <w:highlight w:val="white"/>
-        </w:rPr>
-        <w:t>NRU</w:t>
-      </w:r>
-      <w:r>
-        <w:rPr>
-          <w:rFonts w:ascii="Calibri" w:eastAsia="Calibri" w:hAnsi="Calibri" w:cs="Calibri"/>
-          <w:color w:val="222222"/>
-          <w:sz w:val="22"/>
-          <w:szCs w:val="22"/>
-          <w:highlight w:val="white"/>
-        </w:rPr>
-        <w:t xml:space="preserve">. Only identified </w:t>
-      </w:r>
-      <w:r>
-        <w:rPr>
-          <w:rFonts w:ascii="Calibri" w:eastAsia="Calibri" w:hAnsi="Calibri" w:cs="Calibri"/>
-          <w:color w:val="222222"/>
-          <w:sz w:val="22"/>
-          <w:szCs w:val="22"/>
-          <w:highlight w:val="white"/>
-        </w:rPr>
-        <w:t>NRU</w:t>
-      </w:r>
-      <w:r>
-        <w:rPr>
-          <w:rFonts w:ascii="Calibri" w:eastAsia="Calibri" w:hAnsi="Calibri" w:cs="Calibri"/>
-          <w:color w:val="222222"/>
-          <w:sz w:val="22"/>
-          <w:szCs w:val="22"/>
-          <w:highlight w:val="white"/>
-        </w:rPr>
-        <w:t xml:space="preserve"> personnel have access to the mentioned servers.</w:t>
-      </w:r>
+        <w:ind w:leftChars="0" w:left="0" w:firstLineChars="0" w:firstLine="284"/>
+        <w:contextualSpacing/>
+        <w:rPr>
+          <w:rFonts w:ascii="Calibri" w:eastAsia="Calibri" w:hAnsi="Calibri" w:cs="Calibri"/>
+          <w:color w:val="222222"/>
+          <w:sz w:val="22"/>
+          <w:szCs w:val="22"/>
+        </w:rPr>
+      </w:pPr>
     </w:p>
     <w:p>
       <w:pPr>
@@ -8158,9 +8886,12 @@
         <w:contextualSpacing/>
         <w:rPr>
           <w:rFonts w:ascii="Calibri" w:eastAsia="Calibri" w:hAnsi="Calibri" w:cs="Calibri"/>
-          <w:color w:val="222222"/>
-          <w:sz w:val="22"/>
-          <w:szCs w:val="22"/>
+          <w:b/>
+          <w:color w:val="222222"/>
+          <w:sz w:val="22"/>
+          <w:szCs w:val="22"/>
+          <w:highlight w:val="white"/>
+          <w:u w:val="single"/>
         </w:rPr>
       </w:pPr>
     </w:p>
@@ -8186,6 +8917,18 @@
           <w:u w:val="single"/>
         </w:rPr>
       </w:pPr>
+      <w:r>
+        <w:rPr>
+          <w:rFonts w:ascii="Calibri" w:eastAsia="Calibri" w:hAnsi="Calibri" w:cs="Calibri"/>
+          <w:b/>
+          <w:color w:val="222222"/>
+          <w:sz w:val="22"/>
+          <w:szCs w:val="22"/>
+          <w:highlight w:val="white"/>
+          <w:u w:val="single"/>
+        </w:rPr>
+        <w:t>Duration of services:</w:t>
+      </w:r>
     </w:p>
     <w:p>
       <w:pPr>
@@ -8201,25 +8944,34 @@
         <w:contextualSpacing/>
         <w:rPr>
           <w:rFonts w:ascii="Calibri" w:eastAsia="Calibri" w:hAnsi="Calibri" w:cs="Calibri"/>
+          <w:color w:val="222222"/>
+          <w:sz w:val="22"/>
+          <w:szCs w:val="22"/>
+          <w:highlight w:val="white"/>
+          <w:u w:val="single"/>
+        </w:rPr>
+      </w:pPr>
+    </w:p>
+    <w:p>
+      <w:pPr>
+        <w:spacing w:line="240" w:lineRule="auto"/>
+        <w:ind w:leftChars="0" w:left="0" w:firstLineChars="0" w:firstLine="284"/>
+        <w:contextualSpacing/>
+        <w:rPr>
+          <w:rFonts w:ascii="Calibri" w:eastAsia="Calibri" w:hAnsi="Calibri" w:cs="Calibri"/>
+          <w:sz w:val="22"/>
+          <w:szCs w:val="22"/>
+        </w:rPr>
+      </w:pPr>
+      <w:r>
+        <w:rPr>
+          <w:rFonts w:ascii="Calibri" w:eastAsia="Calibri" w:hAnsi="Calibri" w:cs="Calibri"/>
           <w:b/>
-          <w:color w:val="222222"/>
-          <w:sz w:val="22"/>
-          <w:szCs w:val="22"/>
-          <w:highlight w:val="white"/>
-          <w:u w:val="single"/>
-        </w:rPr>
-      </w:pPr>
-      <w:r>
-        <w:rPr>
-          <w:rFonts w:ascii="Calibri" w:eastAsia="Calibri" w:hAnsi="Calibri" w:cs="Calibri"/>
-          <w:b/>
-          <w:color w:val="222222"/>
-          <w:sz w:val="22"/>
-          <w:szCs w:val="22"/>
-          <w:highlight w:val="white"/>
-          <w:u w:val="single"/>
-        </w:rPr>
-        <w:t>Duration of services:</w:t>
+          <w:sz w:val="22"/>
+          <w:szCs w:val="22"/>
+          <w:highlight w:val="white"/>
+        </w:rPr>
+        <w:t>The Parties have agreed on the following End Date of the Agreement:</w:t>
       </w:r>
     </w:p>
     <w:p>
@@ -8240,30 +8992,27 @@
           <w:sz w:val="22"/>
           <w:szCs w:val="22"/>
           <w:highlight w:val="white"/>
-          <w:u w:val="single"/>
-        </w:rPr>
-      </w:pPr>
-    </w:p>
-    <w:p>
-      <w:pPr>
-        <w:spacing w:line="240" w:lineRule="auto"/>
-        <w:ind w:leftChars="0" w:left="0" w:firstLineChars="0" w:firstLine="284"/>
-        <w:contextualSpacing/>
-        <w:rPr>
-          <w:rFonts w:ascii="Calibri" w:eastAsia="Calibri" w:hAnsi="Calibri" w:cs="Calibri"/>
-          <w:sz w:val="22"/>
-          <w:szCs w:val="22"/>
-        </w:rPr>
-      </w:pPr>
-      <w:r>
-        <w:rPr>
-          <w:rFonts w:ascii="Calibri" w:eastAsia="Calibri" w:hAnsi="Calibri" w:cs="Calibri"/>
-          <w:b/>
-          <w:sz w:val="22"/>
-          <w:szCs w:val="22"/>
-          <w:highlight w:val="white"/>
-        </w:rPr>
-        <w:t>The Parties have agreed on the following End Date of the Agreement:</w:t>
+        </w:rPr>
+      </w:pPr>
+      <w:r>
+        <w:rPr>
+          <w:rFonts w:ascii="Calibri" w:eastAsia="Calibri" w:hAnsi="Calibri" w:cs="Calibri"/>
+          <w:color w:val="222222"/>
+          <w:sz w:val="22"/>
+          <w:szCs w:val="22"/>
+          <w:highlight w:val="yellow"/>
+        </w:rPr>
+        <w:t xml:space="preserve">Date: </w:t>
+      </w:r>
+      <w:r>
+        <w:rPr>
+          <w:rFonts w:ascii="Calibri" w:eastAsia="Calibri" w:hAnsi="Calibri" w:cs="Calibri"/>
+          <w:color w:val="222222"/>
+          <w:sz w:val="22"/>
+          <w:szCs w:val="22"/>
+          <w:highlight w:val="white"/>
+        </w:rPr>
+        <w:t xml:space="preserve"> </w:t>
       </w:r>
     </w:p>
     <w:p>
@@ -8286,26 +9035,6 @@
           <w:highlight w:val="white"/>
         </w:rPr>
       </w:pPr>
-      <w:r>
-        <w:rPr>
-          <w:rFonts w:ascii="Calibri" w:eastAsia="Calibri" w:hAnsi="Calibri" w:cs="Calibri"/>
-          <w:color w:val="222222"/>
-          <w:sz w:val="22"/>
-          <w:szCs w:val="22"/>
-          <w:highlight w:val="yellow"/>
-        </w:rPr>
-        <w:t xml:space="preserve">Date: </w:t>
-      </w:r>
-      <w:r>
-        <w:rPr>
-          <w:rFonts w:ascii="Calibri" w:eastAsia="Calibri" w:hAnsi="Calibri" w:cs="Calibri"/>
-          <w:color w:val="222222"/>
-          <w:sz w:val="22"/>
-          <w:szCs w:val="22"/>
-          <w:highlight w:val="white"/>
-        </w:rPr>
-        <w:t xml:space="preserve"> </w:t>
-      </w:r>
     </w:p>
     <w:p>
       <w:pPr>
@@ -8317,27 +9046,6 @@
           <w:between w:val="nil"/>
         </w:pBdr>
         <w:spacing w:line="240" w:lineRule="auto"/>
-        <w:ind w:leftChars="0" w:left="0" w:firstLineChars="0" w:firstLine="284"/>
-        <w:contextualSpacing/>
-        <w:rPr>
-          <w:rFonts w:ascii="Calibri" w:eastAsia="Calibri" w:hAnsi="Calibri" w:cs="Calibri"/>
-          <w:color w:val="222222"/>
-          <w:sz w:val="22"/>
-          <w:szCs w:val="22"/>
-          <w:highlight w:val="white"/>
-        </w:rPr>
-      </w:pPr>
-    </w:p>
-    <w:p>
-      <w:pPr>
-        <w:pBdr>
-          <w:top w:val="nil"/>
-          <w:left w:val="nil"/>
-          <w:bottom w:val="nil"/>
-          <w:right w:val="nil"/>
-          <w:between w:val="nil"/>
-        </w:pBdr>
-        <w:spacing w:line="240" w:lineRule="auto"/>
         <w:ind w:leftChars="0" w:left="284" w:firstLineChars="0" w:firstLine="0"/>
         <w:contextualSpacing/>
         <w:rPr>
@@ -8356,7 +9064,29 @@
           <w:szCs w:val="22"/>
           <w:highlight w:val="white"/>
         </w:rPr>
-        <w:t xml:space="preserve">The parties have agreed that services can be terminated earlier than the end date i) </w:t>
+        <w:t xml:space="preserve">The parties have agreed that services can be terminated earlier than the end date </w:t>
+      </w:r>
+      <w:proofErr w:type="spellStart"/>
+      <w:r>
+        <w:rPr>
+          <w:rFonts w:ascii="Calibri" w:eastAsia="Calibri" w:hAnsi="Calibri" w:cs="Calibri"/>
+          <w:color w:val="222222"/>
+          <w:sz w:val="22"/>
+          <w:szCs w:val="22"/>
+          <w:highlight w:val="white"/>
+        </w:rPr>
+        <w:t>i</w:t>
+      </w:r>
+      <w:proofErr w:type="spellEnd"/>
+      <w:r>
+        <w:rPr>
+          <w:rFonts w:ascii="Calibri" w:eastAsia="Calibri" w:hAnsi="Calibri" w:cs="Calibri"/>
+          <w:color w:val="222222"/>
+          <w:sz w:val="22"/>
+          <w:szCs w:val="22"/>
+          <w:highlight w:val="white"/>
+        </w:rPr>
+        <w:t xml:space="preserve">) </w:t>
       </w:r>
       <w:r>
         <w:rPr>
@@ -8772,7 +9502,6 @@
           <w:szCs w:val="22"/>
           <w:u w:val="single"/>
         </w:rPr>
-        <w:lastRenderedPageBreak/>
         <w:t>Service fees and invoicing:</w:t>
       </w:r>
     </w:p>
@@ -13172,7 +13901,25 @@
           <w:sz w:val="22"/>
           <w:szCs w:val="22"/>
         </w:rPr>
-        <w:t>In the case of termination, cancellation or rescission of the Principal Agreement or the Data Processing Agreement, the Data Processor is obliged, at the request of the Data Controller, to provide termination assistance to the Data Controller until (i) all personal data has been transferred to the Data Controller in an ordinary, recognised electronic format, and (ii) the services described in the Principal Agreement have been satisfactorily handed over to the Data Controller or a new supplier selected by the Data Controller. The Data Processor must continue to process personal data and to deliver the services in accordance with the Principal Agreement until a satisfactory handover has taken place.</w:t>
+        <w:t>In the case of termination, cancellation or rescission of the Principal Agreement or the Data Processing Agreement, the Data Processor is obliged, at the request of the Data Controller, to provide termination assistance to the Data Controller until (</w:t>
+      </w:r>
+      <w:proofErr w:type="spellStart"/>
+      <w:r>
+        <w:rPr>
+          <w:rFonts w:asciiTheme="majorHAnsi" w:eastAsia="Calibri" w:hAnsiTheme="majorHAnsi" w:cstheme="majorHAnsi"/>
+          <w:sz w:val="22"/>
+          <w:szCs w:val="22"/>
+        </w:rPr>
+        <w:t>i</w:t>
+      </w:r>
+      <w:proofErr w:type="spellEnd"/>
+      <w:r>
+        <w:rPr>
+          <w:rFonts w:asciiTheme="majorHAnsi" w:eastAsia="Calibri" w:hAnsiTheme="majorHAnsi" w:cstheme="majorHAnsi"/>
+          <w:sz w:val="22"/>
+          <w:szCs w:val="22"/>
+        </w:rPr>
+        <w:t>) all personal data has been transferred to the Data Controller in an ordinary, recognised electronic format, and (ii) the services described in the Principal Agreement have been satisfactorily handed over to the Data Controller or a new supplier selected by the Data Controller. The Data Processor must continue to process personal data and to deliver the services in accordance with the Principal Agreement until a satisfactory handover has taken place.</w:t>
       </w:r>
     </w:p>
     <w:p>
@@ -15579,7 +16326,25 @@
           <w:sz w:val="22"/>
           <w:szCs w:val="22"/>
         </w:rPr>
-        <w:t>.1. Public-nEUro users data access is regulated as per Schedule B.</w:t>
+        <w:t>.1. Public-</w:t>
+      </w:r>
+      <w:proofErr w:type="spellStart"/>
+      <w:r>
+        <w:rPr>
+          <w:rFonts w:ascii="Calibri" w:eastAsia="Calibri" w:hAnsi="Calibri" w:cs="Calibri"/>
+          <w:sz w:val="22"/>
+          <w:szCs w:val="22"/>
+        </w:rPr>
+        <w:t>nEUro</w:t>
+      </w:r>
+      <w:proofErr w:type="spellEnd"/>
+      <w:r>
+        <w:rPr>
+          <w:rFonts w:ascii="Calibri" w:eastAsia="Calibri" w:hAnsi="Calibri" w:cs="Calibri"/>
+          <w:sz w:val="22"/>
+          <w:szCs w:val="22"/>
+        </w:rPr>
+        <w:t xml:space="preserve"> users data access is regulated as per Schedule B.</w:t>
       </w:r>
     </w:p>
     <w:p>
@@ -17681,12 +18446,12 @@
       </w:pPr>
     </w:p>
     <w:sectPr>
-      <w:headerReference w:type="even" r:id="rId19"/>
-      <w:headerReference w:type="default" r:id="rId20"/>
-      <w:footerReference w:type="even" r:id="rId21"/>
-      <w:footerReference w:type="default" r:id="rId22"/>
-      <w:headerReference w:type="first" r:id="rId23"/>
-      <w:footerReference w:type="first" r:id="rId24"/>
+      <w:headerReference w:type="even" r:id="rId18"/>
+      <w:headerReference w:type="default" r:id="rId19"/>
+      <w:footerReference w:type="even" r:id="rId20"/>
+      <w:footerReference w:type="default" r:id="rId21"/>
+      <w:headerReference w:type="first" r:id="rId22"/>
+      <w:footerReference w:type="first" r:id="rId23"/>
       <w:pgSz w:w="11906" w:h="16838"/>
       <w:pgMar w:top="993" w:right="1134" w:bottom="1701" w:left="1134" w:header="709" w:footer="709" w:gutter="0"/>
       <w:pgNumType w:start="1"/>
@@ -17724,7 +18489,7 @@
 </file>
 
 <file path=word/footer1.xml><?xml version="1.0" encoding="utf-8"?>
-<w:ftr xmlns:wpc="http://schemas.microsoft.com/office/word/2010/wordprocessingCanvas" xmlns:mc="http://schemas.openxmlformats.org/markup-compatibility/2006" xmlns:o="urn:schemas-microsoft-com:office:office" xmlns:r="http://schemas.openxmlformats.org/officeDocument/2006/relationships" xmlns:m="http://schemas.openxmlformats.org/officeDocument/2006/math" xmlns:v="urn:schemas-microsoft-com:vml" xmlns:wp14="http://schemas.microsoft.com/office/word/2010/wordprocessingDrawing" xmlns:wp="http://schemas.openxmlformats.org/drawingml/2006/wordprocessingDrawing" xmlns:w10="urn:schemas-microsoft-com:office:word" xmlns:w="http://schemas.openxmlformats.org/wordprocessingml/2006/main" xmlns:w14="http://schemas.microsoft.com/office/word/2010/wordml" xmlns:w15="http://schemas.microsoft.com/office/word/2012/wordml" xmlns:w16se="http://schemas.microsoft.com/office/word/2015/wordml/symex" xmlns:w16cid="http://schemas.microsoft.com/office/word/2016/wordml/cid" xmlns:w16="http://schemas.microsoft.com/office/word/2018/wordml" xmlns:w16cex="http://schemas.microsoft.com/office/word/2018/wordml/cex" xmlns:w16sdtdh="http://schemas.microsoft.com/office/word/2020/wordml/sdtdatahash" xmlns:wne="http://schemas.microsoft.com/office/word/2006/wordml" xmlns:wpg="http://schemas.microsoft.com/office/word/2010/wordprocessingGroup" xmlns:wps="http://schemas.microsoft.com/office/word/2010/wordprocessingShape">
+<w:ftr xmlns:wpc="http://schemas.microsoft.com/office/word/2010/wordprocessingCanvas" xmlns:cx="http://schemas.microsoft.com/office/drawing/2014/chartex" xmlns:cx1="http://schemas.microsoft.com/office/drawing/2015/9/8/chartex" xmlns:cx2="http://schemas.microsoft.com/office/drawing/2015/10/21/chartex" xmlns:cx3="http://schemas.microsoft.com/office/drawing/2016/5/9/chartex" xmlns:cx4="http://schemas.microsoft.com/office/drawing/2016/5/10/chartex" xmlns:cx5="http://schemas.microsoft.com/office/drawing/2016/5/11/chartex" xmlns:cx6="http://schemas.microsoft.com/office/drawing/2016/5/12/chartex" xmlns:cx7="http://schemas.microsoft.com/office/drawing/2016/5/13/chartex" xmlns:cx8="http://schemas.microsoft.com/office/drawing/2016/5/14/chartex" xmlns:mc="http://schemas.openxmlformats.org/markup-compatibility/2006" xmlns:aink="http://schemas.microsoft.com/office/drawing/2016/ink" xmlns:am3d="http://schemas.microsoft.com/office/drawing/2017/model3d" xmlns:o="urn:schemas-microsoft-com:office:office" xmlns:oel="http://schemas.microsoft.com/office/2019/extlst" xmlns:r="http://schemas.openxmlformats.org/officeDocument/2006/relationships" xmlns:m="http://schemas.openxmlformats.org/officeDocument/2006/math" xmlns:v="urn:schemas-microsoft-com:vml" xmlns:wp14="http://schemas.microsoft.com/office/word/2010/wordprocessingDrawing" xmlns:wp="http://schemas.openxmlformats.org/drawingml/2006/wordprocessingDrawing" xmlns:w10="urn:schemas-microsoft-com:office:word" xmlns:w="http://schemas.openxmlformats.org/wordprocessingml/2006/main" xmlns:w14="http://schemas.microsoft.com/office/word/2010/wordml" xmlns:w15="http://schemas.microsoft.com/office/word/2012/wordml" xmlns:w16cex="http://schemas.microsoft.com/office/word/2018/wordml/cex" xmlns:w16cid="http://schemas.microsoft.com/office/word/2016/wordml/cid" xmlns:w16="http://schemas.microsoft.com/office/word/2018/wordml" xmlns:w16du="http://schemas.microsoft.com/office/word/2023/wordml/word16du" xmlns:w16sdtdh="http://schemas.microsoft.com/office/word/2020/wordml/sdtdatahash" xmlns:w16sdtfl="http://schemas.microsoft.com/office/word/2024/wordml/sdtformatlock" xmlns:w16se="http://schemas.microsoft.com/office/word/2015/wordml/symex" xmlns:wpg="http://schemas.microsoft.com/office/word/2010/wordprocessingGroup" xmlns:wpi="http://schemas.microsoft.com/office/word/2010/wordprocessingInk" xmlns:wne="http://schemas.microsoft.com/office/word/2006/wordml" xmlns:wps="http://schemas.microsoft.com/office/word/2010/wordprocessingShape" mc:Ignorable="w14 w15 w16se w16cid w16 w16cex w16sdtdh w16sdtfl w16du wp14">
   <w:p>
     <w:pPr>
       <w:pBdr>
@@ -17792,7 +18557,7 @@
 </file>
 
 <file path=word/footer2.xml><?xml version="1.0" encoding="utf-8"?>
-<w:ftr xmlns:wpc="http://schemas.microsoft.com/office/word/2010/wordprocessingCanvas" xmlns:mc="http://schemas.openxmlformats.org/markup-compatibility/2006" xmlns:o="urn:schemas-microsoft-com:office:office" xmlns:r="http://schemas.openxmlformats.org/officeDocument/2006/relationships" xmlns:m="http://schemas.openxmlformats.org/officeDocument/2006/math" xmlns:v="urn:schemas-microsoft-com:vml" xmlns:wp14="http://schemas.microsoft.com/office/word/2010/wordprocessingDrawing" xmlns:wp="http://schemas.openxmlformats.org/drawingml/2006/wordprocessingDrawing" xmlns:w10="urn:schemas-microsoft-com:office:word" xmlns:w="http://schemas.openxmlformats.org/wordprocessingml/2006/main" xmlns:w14="http://schemas.microsoft.com/office/word/2010/wordml" xmlns:w15="http://schemas.microsoft.com/office/word/2012/wordml" xmlns:w16se="http://schemas.microsoft.com/office/word/2015/wordml/symex" xmlns:w16cid="http://schemas.microsoft.com/office/word/2016/wordml/cid" xmlns:w16="http://schemas.microsoft.com/office/word/2018/wordml" xmlns:w16cex="http://schemas.microsoft.com/office/word/2018/wordml/cex" xmlns:w16sdtdh="http://schemas.microsoft.com/office/word/2020/wordml/sdtdatahash" xmlns:wne="http://schemas.microsoft.com/office/word/2006/wordml" xmlns:wpg="http://schemas.microsoft.com/office/word/2010/wordprocessingGroup" xmlns:wps="http://schemas.microsoft.com/office/word/2010/wordprocessingShape">
+<w:ftr xmlns:wpc="http://schemas.microsoft.com/office/word/2010/wordprocessingCanvas" xmlns:cx="http://schemas.microsoft.com/office/drawing/2014/chartex" xmlns:cx1="http://schemas.microsoft.com/office/drawing/2015/9/8/chartex" xmlns:cx2="http://schemas.microsoft.com/office/drawing/2015/10/21/chartex" xmlns:cx3="http://schemas.microsoft.com/office/drawing/2016/5/9/chartex" xmlns:cx4="http://schemas.microsoft.com/office/drawing/2016/5/10/chartex" xmlns:cx5="http://schemas.microsoft.com/office/drawing/2016/5/11/chartex" xmlns:cx6="http://schemas.microsoft.com/office/drawing/2016/5/12/chartex" xmlns:cx7="http://schemas.microsoft.com/office/drawing/2016/5/13/chartex" xmlns:cx8="http://schemas.microsoft.com/office/drawing/2016/5/14/chartex" xmlns:mc="http://schemas.openxmlformats.org/markup-compatibility/2006" xmlns:aink="http://schemas.microsoft.com/office/drawing/2016/ink" xmlns:am3d="http://schemas.microsoft.com/office/drawing/2017/model3d" xmlns:o="urn:schemas-microsoft-com:office:office" xmlns:oel="http://schemas.microsoft.com/office/2019/extlst" xmlns:r="http://schemas.openxmlformats.org/officeDocument/2006/relationships" xmlns:m="http://schemas.openxmlformats.org/officeDocument/2006/math" xmlns:v="urn:schemas-microsoft-com:vml" xmlns:wp14="http://schemas.microsoft.com/office/word/2010/wordprocessingDrawing" xmlns:wp="http://schemas.openxmlformats.org/drawingml/2006/wordprocessingDrawing" xmlns:w10="urn:schemas-microsoft-com:office:word" xmlns:w="http://schemas.openxmlformats.org/wordprocessingml/2006/main" xmlns:w14="http://schemas.microsoft.com/office/word/2010/wordml" xmlns:w15="http://schemas.microsoft.com/office/word/2012/wordml" xmlns:w16cex="http://schemas.microsoft.com/office/word/2018/wordml/cex" xmlns:w16cid="http://schemas.microsoft.com/office/word/2016/wordml/cid" xmlns:w16="http://schemas.microsoft.com/office/word/2018/wordml" xmlns:w16du="http://schemas.microsoft.com/office/word/2023/wordml/word16du" xmlns:w16sdtdh="http://schemas.microsoft.com/office/word/2020/wordml/sdtdatahash" xmlns:w16sdtfl="http://schemas.microsoft.com/office/word/2024/wordml/sdtformatlock" xmlns:w16se="http://schemas.microsoft.com/office/word/2015/wordml/symex" xmlns:wpg="http://schemas.microsoft.com/office/word/2010/wordprocessingGroup" xmlns:wpi="http://schemas.microsoft.com/office/word/2010/wordprocessingInk" xmlns:wne="http://schemas.microsoft.com/office/word/2006/wordml" xmlns:wps="http://schemas.microsoft.com/office/word/2010/wordprocessingShape" mc:Ignorable="w14 w15 w16se w16cid w16 w16cex w16sdtdh w16sdtfl w16du wp14">
   <w:p>
     <w:pPr>
       <w:pBdr>
@@ -17846,17 +18611,17 @@
   <w:tbl>
     <w:tblPr>
       <w:tblStyle w:val="TableGrid"/>
-      <w:tblpPr w:horzAnchor="margin" w:vertAnchor="text" w:tblpXSpec="center" w:tblpY="17" w:leftFromText="141" w:rightFromText="141"/>
+      <w:tblpPr w:leftFromText="141" w:rightFromText="141" w:vertAnchor="text" w:horzAnchor="margin" w:tblpXSpec="center" w:tblpY="17"/>
       <w:tblW w:w="0" w:type="auto"/>
       <w:tblBorders>
         <w:top w:val="single" w:sz="4" w:space="0" w:color="FF0000"/>
         <w:left w:val="single" w:sz="4" w:space="0" w:color="FF0000"/>
         <w:bottom w:val="single" w:sz="4" w:space="0" w:color="FF0000"/>
         <w:right w:val="single" w:sz="4" w:space="0" w:color="FF0000"/>
-        <w:insideH w:val="none"/>
-        <w:insideV w:val="none"/>
+        <w:insideH w:val="none" w:sz="0" w:space="0" w:color="auto"/>
+        <w:insideV w:val="none" w:sz="0" w:space="0" w:color="auto"/>
       </w:tblBorders>
-      <w:tblLook w:firstRow="1" w:firstColumn="1" w:noVBand="1"/>
+      <w:tblLook w:val="07E0" w:firstRow="1" w:lastRow="1" w:firstColumn="1" w:lastColumn="1" w:noHBand="1" w:noVBand="1"/>
     </w:tblPr>
     <w:tblGrid>
       <w:gridCol w:w="9106"/>
@@ -17877,23 +18642,25 @@
         </w:tcPr>
         <w:p>
           <w:pPr>
+            <w:spacing w:line="240" w:lineRule="auto"/>
+            <w:ind w:left="0" w:hanging="2"/>
             <w:contextualSpacing/>
-            <w:spacing w:line="240" w:lineRule="auto"/>
-            <w:ind w:left="0"/>
+            <w:textDirection w:val="lrTb"/>
             <w:rPr>
-              <w:rFonts w:ascii="Calibri" w:hAnsi="Calibri" w:cs="Calibri" w:asciiTheme="majorHAnsi" w:hAnsiTheme="majorHAnsi" w:csTheme="majorHAnsi"/>
+              <w:rFonts w:asciiTheme="majorHAnsi" w:hAnsiTheme="majorHAnsi" w:cs="Calibri"/>
               <w:bCs/>
             </w:rPr>
           </w:pPr>
         </w:p>
         <w:p>
           <w:pPr>
+            <w:spacing w:line="240" w:lineRule="auto"/>
+            <w:ind w:left="0" w:hanging="2"/>
             <w:contextualSpacing/>
-            <w:spacing w:line="240" w:lineRule="auto"/>
-            <w:ind w:left="0"/>
             <w:jc w:val="center"/>
+            <w:textDirection w:val="lrTb"/>
             <w:rPr>
-              <w:rFonts w:ascii="Calibri" w:hAnsi="Calibri" w:cs="Calibri" w:asciiTheme="majorHAnsi" w:hAnsiTheme="majorHAnsi" w:csTheme="majorHAnsi"/>
+              <w:rFonts w:asciiTheme="majorHAnsi" w:hAnsiTheme="majorHAnsi" w:cs="Calibri"/>
               <w:bCs/>
               <w:sz w:val="16"/>
               <w:szCs w:val="16"/>
@@ -17901,76 +18668,43 @@
           </w:pPr>
           <w:r>
             <w:rPr>
-              <w:rFonts w:ascii="Calibri" w:hAnsi="Calibri" w:cs="Calibri" w:asciiTheme="majorHAnsi" w:hAnsiTheme="majorHAnsi" w:csTheme="majorHAnsi"/>
+              <w:rFonts w:asciiTheme="majorHAnsi" w:hAnsiTheme="majorHAnsi" w:cs="Calibri"/>
               <w:bCs/>
               <w:sz w:val="16"/>
               <w:szCs w:val="16"/>
             </w:rPr>
-            <w:t>All transfer</w:t>
+            <w:t>All transfers of data governed by the agreement must be approved by the Department of Scientific Research (</w:t>
           </w:r>
+          <w:proofErr w:type="spellStart"/>
           <w:r>
             <w:rPr>
-              <w:rFonts w:ascii="Calibri" w:hAnsi="Calibri" w:cs="Calibri" w:asciiTheme="majorHAnsi" w:hAnsiTheme="majorHAnsi" w:csTheme="majorHAnsi"/>
+              <w:rFonts w:asciiTheme="majorHAnsi" w:hAnsiTheme="majorHAnsi" w:cs="Calibri"/>
               <w:bCs/>
               <w:sz w:val="16"/>
               <w:szCs w:val="16"/>
             </w:rPr>
-            <w:t>s</w:t>
+            <w:t>Forskningsjura</w:t>
           </w:r>
+          <w:proofErr w:type="spellEnd"/>
           <w:r>
             <w:rPr>
-              <w:rFonts w:ascii="Calibri" w:hAnsi="Calibri" w:cs="Calibri" w:asciiTheme="majorHAnsi" w:hAnsiTheme="majorHAnsi" w:csTheme="majorHAnsi"/>
+              <w:rFonts w:asciiTheme="majorHAnsi" w:hAnsiTheme="majorHAnsi" w:cs="Calibri"/>
               <w:bCs/>
               <w:sz w:val="16"/>
               <w:szCs w:val="16"/>
             </w:rPr>
-            <w:t xml:space="preserve"> of data governed by the agreement must be approved by </w:t>
-          </w:r>
-          <w:r>
-            <w:rPr>
-              <w:rFonts w:ascii="Calibri" w:hAnsi="Calibri" w:cs="Calibri" w:asciiTheme="majorHAnsi" w:hAnsiTheme="majorHAnsi" w:csTheme="majorHAnsi"/>
-              <w:bCs/>
-              <w:sz w:val="16"/>
-              <w:szCs w:val="16"/>
-            </w:rPr>
-            <w:t xml:space="preserve">the </w:t>
-          </w:r>
-          <w:r>
-            <w:rPr>
-              <w:rFonts w:ascii="Calibri" w:hAnsi="Calibri" w:cs="Calibri" w:asciiTheme="majorHAnsi" w:hAnsiTheme="majorHAnsi" w:csTheme="majorHAnsi"/>
-              <w:bCs/>
-              <w:sz w:val="16"/>
-              <w:szCs w:val="16"/>
-            </w:rPr>
-            <w:t>Department</w:t>
-          </w:r>
-          <w:r>
-            <w:rPr>
-              <w:rFonts w:ascii="Calibri" w:hAnsi="Calibri" w:cs="Calibri" w:asciiTheme="majorHAnsi" w:hAnsiTheme="majorHAnsi" w:csTheme="majorHAnsi"/>
-              <w:bCs/>
-              <w:sz w:val="16"/>
-              <w:szCs w:val="16"/>
-            </w:rPr>
-            <w:t xml:space="preserve"> of Scientific Research</w:t>
-          </w:r>
-          <w:r>
-            <w:rPr>
-              <w:rFonts w:ascii="Calibri" w:hAnsi="Calibri" w:cs="Calibri" w:asciiTheme="majorHAnsi" w:hAnsiTheme="majorHAnsi" w:csTheme="majorHAnsi"/>
-              <w:bCs/>
-              <w:sz w:val="16"/>
-              <w:szCs w:val="16"/>
-            </w:rPr>
-            <w:t xml:space="preserve"> (Forskningsjura) via Privacy registration for the project ”HEDIT: Healthy Digital Twin”, p-2023-14696.</w:t>
+            <w:t>) via Privacy registration for the project ”HEDIT: Healthy Digital Twin”, p-2023-14696.</w:t>
           </w:r>
         </w:p>
         <w:p>
           <w:pPr>
+            <w:spacing w:line="240" w:lineRule="auto"/>
+            <w:ind w:left="0" w:hanging="2"/>
             <w:contextualSpacing/>
-            <w:spacing w:line="240" w:lineRule="auto"/>
-            <w:ind w:left="0"/>
             <w:jc w:val="center"/>
+            <w:textDirection w:val="lrTb"/>
             <w:rPr>
-              <w:rFonts w:ascii="Calibri" w:hAnsi="Calibri" w:cs="Calibri" w:asciiTheme="majorHAnsi" w:hAnsiTheme="majorHAnsi" w:csTheme="majorHAnsi"/>
+              <w:rFonts w:asciiTheme="majorHAnsi" w:hAnsiTheme="majorHAnsi" w:cs="Calibri"/>
               <w:bCs/>
               <w:sz w:val="16"/>
               <w:szCs w:val="16"/>
@@ -17979,12 +18713,13 @@
         </w:p>
         <w:p>
           <w:pPr>
+            <w:spacing w:line="240" w:lineRule="auto"/>
+            <w:ind w:left="0" w:hanging="2"/>
             <w:contextualSpacing/>
-            <w:spacing w:line="240" w:lineRule="auto"/>
-            <w:ind w:left="0"/>
             <w:jc w:val="center"/>
+            <w:textDirection w:val="lrTb"/>
             <w:rPr>
-              <w:rFonts w:ascii="Calibri" w:hAnsi="Calibri" w:cs="Calibri" w:asciiTheme="majorHAnsi" w:hAnsiTheme="majorHAnsi" w:csTheme="majorHAnsi"/>
+              <w:rFonts w:asciiTheme="majorHAnsi" w:hAnsiTheme="majorHAnsi" w:cs="Calibri"/>
               <w:bCs/>
               <w:sz w:val="16"/>
               <w:szCs w:val="16"/>
@@ -17992,7 +18727,7 @@
           </w:pPr>
           <w:r>
             <w:rPr>
-              <w:rFonts w:ascii="Calibri" w:hAnsi="Calibri" w:cs="Calibri" w:asciiTheme="majorHAnsi" w:hAnsiTheme="majorHAnsi" w:csTheme="majorHAnsi"/>
+              <w:rFonts w:asciiTheme="majorHAnsi" w:hAnsiTheme="majorHAnsi" w:cs="Calibri"/>
               <w:bCs/>
               <w:sz w:val="16"/>
               <w:szCs w:val="16"/>
@@ -18026,7 +18761,7 @@
 </file>
 
 <file path=word/footer3.xml><?xml version="1.0" encoding="utf-8"?>
-<w:ftr xmlns:wpc="http://schemas.microsoft.com/office/word/2010/wordprocessingCanvas" xmlns:mc="http://schemas.openxmlformats.org/markup-compatibility/2006" xmlns:o="urn:schemas-microsoft-com:office:office" xmlns:r="http://schemas.openxmlformats.org/officeDocument/2006/relationships" xmlns:m="http://schemas.openxmlformats.org/officeDocument/2006/math" xmlns:v="urn:schemas-microsoft-com:vml" xmlns:wp14="http://schemas.microsoft.com/office/word/2010/wordprocessingDrawing" xmlns:wp="http://schemas.openxmlformats.org/drawingml/2006/wordprocessingDrawing" xmlns:w10="urn:schemas-microsoft-com:office:word" xmlns:w="http://schemas.openxmlformats.org/wordprocessingml/2006/main" xmlns:w14="http://schemas.microsoft.com/office/word/2010/wordml" xmlns:w15="http://schemas.microsoft.com/office/word/2012/wordml" xmlns:w16se="http://schemas.microsoft.com/office/word/2015/wordml/symex" xmlns:w16cid="http://schemas.microsoft.com/office/word/2016/wordml/cid" xmlns:w16="http://schemas.microsoft.com/office/word/2018/wordml" xmlns:w16cex="http://schemas.microsoft.com/office/word/2018/wordml/cex" xmlns:w16sdtdh="http://schemas.microsoft.com/office/word/2020/wordml/sdtdatahash" xmlns:wne="http://schemas.microsoft.com/office/word/2006/wordml" xmlns:wpg="http://schemas.microsoft.com/office/word/2010/wordprocessingGroup" xmlns:wps="http://schemas.microsoft.com/office/word/2010/wordprocessingShape">
+<w:ftr xmlns:wpc="http://schemas.microsoft.com/office/word/2010/wordprocessingCanvas" xmlns:cx="http://schemas.microsoft.com/office/drawing/2014/chartex" xmlns:cx1="http://schemas.microsoft.com/office/drawing/2015/9/8/chartex" xmlns:cx2="http://schemas.microsoft.com/office/drawing/2015/10/21/chartex" xmlns:cx3="http://schemas.microsoft.com/office/drawing/2016/5/9/chartex" xmlns:cx4="http://schemas.microsoft.com/office/drawing/2016/5/10/chartex" xmlns:cx5="http://schemas.microsoft.com/office/drawing/2016/5/11/chartex" xmlns:cx6="http://schemas.microsoft.com/office/drawing/2016/5/12/chartex" xmlns:cx7="http://schemas.microsoft.com/office/drawing/2016/5/13/chartex" xmlns:cx8="http://schemas.microsoft.com/office/drawing/2016/5/14/chartex" xmlns:mc="http://schemas.openxmlformats.org/markup-compatibility/2006" xmlns:aink="http://schemas.microsoft.com/office/drawing/2016/ink" xmlns:am3d="http://schemas.microsoft.com/office/drawing/2017/model3d" xmlns:o="urn:schemas-microsoft-com:office:office" xmlns:oel="http://schemas.microsoft.com/office/2019/extlst" xmlns:r="http://schemas.openxmlformats.org/officeDocument/2006/relationships" xmlns:m="http://schemas.openxmlformats.org/officeDocument/2006/math" xmlns:v="urn:schemas-microsoft-com:vml" xmlns:wp14="http://schemas.microsoft.com/office/word/2010/wordprocessingDrawing" xmlns:wp="http://schemas.openxmlformats.org/drawingml/2006/wordprocessingDrawing" xmlns:w10="urn:schemas-microsoft-com:office:word" xmlns:w="http://schemas.openxmlformats.org/wordprocessingml/2006/main" xmlns:w14="http://schemas.microsoft.com/office/word/2010/wordml" xmlns:w15="http://schemas.microsoft.com/office/word/2012/wordml" xmlns:w16cex="http://schemas.microsoft.com/office/word/2018/wordml/cex" xmlns:w16cid="http://schemas.microsoft.com/office/word/2016/wordml/cid" xmlns:w16="http://schemas.microsoft.com/office/word/2018/wordml" xmlns:w16du="http://schemas.microsoft.com/office/word/2023/wordml/word16du" xmlns:w16sdtdh="http://schemas.microsoft.com/office/word/2020/wordml/sdtdatahash" xmlns:w16sdtfl="http://schemas.microsoft.com/office/word/2024/wordml/sdtformatlock" xmlns:w16se="http://schemas.microsoft.com/office/word/2015/wordml/symex" xmlns:wpg="http://schemas.microsoft.com/office/word/2010/wordprocessingGroup" xmlns:wpi="http://schemas.microsoft.com/office/word/2010/wordprocessingInk" xmlns:wne="http://schemas.microsoft.com/office/word/2006/wordml" xmlns:wps="http://schemas.microsoft.com/office/word/2010/wordprocessingShape" mc:Ignorable="w14 w15 w16se w16cid w16 w16cex w16sdtdh w16sdtfl w16du wp14">
   <w:p>
     <w:pPr>
       <w:pStyle w:val="Footer"/>
@@ -18064,7 +18799,7 @@
 </file>
 
 <file path=word/header1.xml><?xml version="1.0" encoding="utf-8"?>
-<w:hdr xmlns:wpc="http://schemas.microsoft.com/office/word/2010/wordprocessingCanvas" xmlns:mc="http://schemas.openxmlformats.org/markup-compatibility/2006" xmlns:o="urn:schemas-microsoft-com:office:office" xmlns:r="http://schemas.openxmlformats.org/officeDocument/2006/relationships" xmlns:m="http://schemas.openxmlformats.org/officeDocument/2006/math" xmlns:v="urn:schemas-microsoft-com:vml" xmlns:wp14="http://schemas.microsoft.com/office/word/2010/wordprocessingDrawing" xmlns:wp="http://schemas.openxmlformats.org/drawingml/2006/wordprocessingDrawing" xmlns:w10="urn:schemas-microsoft-com:office:word" xmlns:w="http://schemas.openxmlformats.org/wordprocessingml/2006/main" xmlns:w14="http://schemas.microsoft.com/office/word/2010/wordml" xmlns:w15="http://schemas.microsoft.com/office/word/2012/wordml" xmlns:w16se="http://schemas.microsoft.com/office/word/2015/wordml/symex" xmlns:w16cid="http://schemas.microsoft.com/office/word/2016/wordml/cid" xmlns:w16="http://schemas.microsoft.com/office/word/2018/wordml" xmlns:w16cex="http://schemas.microsoft.com/office/word/2018/wordml/cex" xmlns:w16sdtdh="http://schemas.microsoft.com/office/word/2020/wordml/sdtdatahash" xmlns:wne="http://schemas.microsoft.com/office/word/2006/wordml" xmlns:wpg="http://schemas.microsoft.com/office/word/2010/wordprocessingGroup" xmlns:wps="http://schemas.microsoft.com/office/word/2010/wordprocessingShape">
+<w:hdr xmlns:wpc="http://schemas.microsoft.com/office/word/2010/wordprocessingCanvas" xmlns:cx="http://schemas.microsoft.com/office/drawing/2014/chartex" xmlns:cx1="http://schemas.microsoft.com/office/drawing/2015/9/8/chartex" xmlns:cx2="http://schemas.microsoft.com/office/drawing/2015/10/21/chartex" xmlns:cx3="http://schemas.microsoft.com/office/drawing/2016/5/9/chartex" xmlns:cx4="http://schemas.microsoft.com/office/drawing/2016/5/10/chartex" xmlns:cx5="http://schemas.microsoft.com/office/drawing/2016/5/11/chartex" xmlns:cx6="http://schemas.microsoft.com/office/drawing/2016/5/12/chartex" xmlns:cx7="http://schemas.microsoft.com/office/drawing/2016/5/13/chartex" xmlns:cx8="http://schemas.microsoft.com/office/drawing/2016/5/14/chartex" xmlns:mc="http://schemas.openxmlformats.org/markup-compatibility/2006" xmlns:aink="http://schemas.microsoft.com/office/drawing/2016/ink" xmlns:am3d="http://schemas.microsoft.com/office/drawing/2017/model3d" xmlns:o="urn:schemas-microsoft-com:office:office" xmlns:oel="http://schemas.microsoft.com/office/2019/extlst" xmlns:r="http://schemas.openxmlformats.org/officeDocument/2006/relationships" xmlns:m="http://schemas.openxmlformats.org/officeDocument/2006/math" xmlns:v="urn:schemas-microsoft-com:vml" xmlns:wp14="http://schemas.microsoft.com/office/word/2010/wordprocessingDrawing" xmlns:wp="http://schemas.openxmlformats.org/drawingml/2006/wordprocessingDrawing" xmlns:w10="urn:schemas-microsoft-com:office:word" xmlns:w="http://schemas.openxmlformats.org/wordprocessingml/2006/main" xmlns:w14="http://schemas.microsoft.com/office/word/2010/wordml" xmlns:w15="http://schemas.microsoft.com/office/word/2012/wordml" xmlns:w16cex="http://schemas.microsoft.com/office/word/2018/wordml/cex" xmlns:w16cid="http://schemas.microsoft.com/office/word/2016/wordml/cid" xmlns:w16="http://schemas.microsoft.com/office/word/2018/wordml" xmlns:w16du="http://schemas.microsoft.com/office/word/2023/wordml/word16du" xmlns:w16sdtdh="http://schemas.microsoft.com/office/word/2020/wordml/sdtdatahash" xmlns:w16sdtfl="http://schemas.microsoft.com/office/word/2024/wordml/sdtformatlock" xmlns:w16se="http://schemas.microsoft.com/office/word/2015/wordml/symex" xmlns:wpg="http://schemas.microsoft.com/office/word/2010/wordprocessingGroup" xmlns:wpi="http://schemas.microsoft.com/office/word/2010/wordprocessingInk" xmlns:wne="http://schemas.microsoft.com/office/word/2006/wordml" xmlns:wps="http://schemas.microsoft.com/office/word/2010/wordprocessingShape" mc:Ignorable="w14 w15 w16se w16cid w16 w16cex w16sdtdh w16sdtfl w16du wp14">
   <w:p>
     <w:pPr>
       <w:pStyle w:val="Header"/>
@@ -18075,7 +18810,7 @@
 </file>
 
 <file path=word/header2.xml><?xml version="1.0" encoding="utf-8"?>
-<w:hdr xmlns:wpc="http://schemas.microsoft.com/office/word/2010/wordprocessingCanvas" xmlns:mc="http://schemas.openxmlformats.org/markup-compatibility/2006" xmlns:o="urn:schemas-microsoft-com:office:office" xmlns:r="http://schemas.openxmlformats.org/officeDocument/2006/relationships" xmlns:m="http://schemas.openxmlformats.org/officeDocument/2006/math" xmlns:v="urn:schemas-microsoft-com:vml" xmlns:wp14="http://schemas.microsoft.com/office/word/2010/wordprocessingDrawing" xmlns:wp="http://schemas.openxmlformats.org/drawingml/2006/wordprocessingDrawing" xmlns:w10="urn:schemas-microsoft-com:office:word" xmlns:w="http://schemas.openxmlformats.org/wordprocessingml/2006/main" xmlns:w14="http://schemas.microsoft.com/office/word/2010/wordml" xmlns:w15="http://schemas.microsoft.com/office/word/2012/wordml" xmlns:w16se="http://schemas.microsoft.com/office/word/2015/wordml/symex" xmlns:w16cid="http://schemas.microsoft.com/office/word/2016/wordml/cid" xmlns:w16="http://schemas.microsoft.com/office/word/2018/wordml" xmlns:w16cex="http://schemas.microsoft.com/office/word/2018/wordml/cex" xmlns:w16sdtdh="http://schemas.microsoft.com/office/word/2020/wordml/sdtdatahash" xmlns:wne="http://schemas.microsoft.com/office/word/2006/wordml" xmlns:wpg="http://schemas.microsoft.com/office/word/2010/wordprocessingGroup" xmlns:wps="http://schemas.microsoft.com/office/word/2010/wordprocessingShape">
+<w:hdr xmlns:wpc="http://schemas.microsoft.com/office/word/2010/wordprocessingCanvas" xmlns:cx="http://schemas.microsoft.com/office/drawing/2014/chartex" xmlns:cx1="http://schemas.microsoft.com/office/drawing/2015/9/8/chartex" xmlns:cx2="http://schemas.microsoft.com/office/drawing/2015/10/21/chartex" xmlns:cx3="http://schemas.microsoft.com/office/drawing/2016/5/9/chartex" xmlns:cx4="http://schemas.microsoft.com/office/drawing/2016/5/10/chartex" xmlns:cx5="http://schemas.microsoft.com/office/drawing/2016/5/11/chartex" xmlns:cx6="http://schemas.microsoft.com/office/drawing/2016/5/12/chartex" xmlns:cx7="http://schemas.microsoft.com/office/drawing/2016/5/13/chartex" xmlns:cx8="http://schemas.microsoft.com/office/drawing/2016/5/14/chartex" xmlns:mc="http://schemas.openxmlformats.org/markup-compatibility/2006" xmlns:aink="http://schemas.microsoft.com/office/drawing/2016/ink" xmlns:am3d="http://schemas.microsoft.com/office/drawing/2017/model3d" xmlns:o="urn:schemas-microsoft-com:office:office" xmlns:oel="http://schemas.microsoft.com/office/2019/extlst" xmlns:r="http://schemas.openxmlformats.org/officeDocument/2006/relationships" xmlns:m="http://schemas.openxmlformats.org/officeDocument/2006/math" xmlns:v="urn:schemas-microsoft-com:vml" xmlns:wp14="http://schemas.microsoft.com/office/word/2010/wordprocessingDrawing" xmlns:wp="http://schemas.openxmlformats.org/drawingml/2006/wordprocessingDrawing" xmlns:w10="urn:schemas-microsoft-com:office:word" xmlns:w="http://schemas.openxmlformats.org/wordprocessingml/2006/main" xmlns:w14="http://schemas.microsoft.com/office/word/2010/wordml" xmlns:w15="http://schemas.microsoft.com/office/word/2012/wordml" xmlns:w16cex="http://schemas.microsoft.com/office/word/2018/wordml/cex" xmlns:w16cid="http://schemas.microsoft.com/office/word/2016/wordml/cid" xmlns:w16="http://schemas.microsoft.com/office/word/2018/wordml" xmlns:w16du="http://schemas.microsoft.com/office/word/2023/wordml/word16du" xmlns:w16sdtdh="http://schemas.microsoft.com/office/word/2020/wordml/sdtdatahash" xmlns:w16sdtfl="http://schemas.microsoft.com/office/word/2024/wordml/sdtformatlock" xmlns:w16se="http://schemas.microsoft.com/office/word/2015/wordml/symex" xmlns:wpg="http://schemas.microsoft.com/office/word/2010/wordprocessingGroup" xmlns:wpi="http://schemas.microsoft.com/office/word/2010/wordprocessingInk" xmlns:wne="http://schemas.microsoft.com/office/word/2006/wordml" xmlns:wps="http://schemas.microsoft.com/office/word/2010/wordprocessingShape" mc:Ignorable="w14 w15 w16se w16cid w16 w16cex w16sdtdh w16sdtfl w16du wp14">
   <w:p>
     <w:pPr>
       <w:pStyle w:val="Header"/>
@@ -18086,7 +18821,7 @@
 </file>
 
 <file path=word/header3.xml><?xml version="1.0" encoding="utf-8"?>
-<w:hdr xmlns:wpc="http://schemas.microsoft.com/office/word/2010/wordprocessingCanvas" xmlns:mc="http://schemas.openxmlformats.org/markup-compatibility/2006" xmlns:o="urn:schemas-microsoft-com:office:office" xmlns:r="http://schemas.openxmlformats.org/officeDocument/2006/relationships" xmlns:m="http://schemas.openxmlformats.org/officeDocument/2006/math" xmlns:v="urn:schemas-microsoft-com:vml" xmlns:wp14="http://schemas.microsoft.com/office/word/2010/wordprocessingDrawing" xmlns:wp="http://schemas.openxmlformats.org/drawingml/2006/wordprocessingDrawing" xmlns:w10="urn:schemas-microsoft-com:office:word" xmlns:w="http://schemas.openxmlformats.org/wordprocessingml/2006/main" xmlns:w14="http://schemas.microsoft.com/office/word/2010/wordml" xmlns:w15="http://schemas.microsoft.com/office/word/2012/wordml" xmlns:w16se="http://schemas.microsoft.com/office/word/2015/wordml/symex" xmlns:w16cid="http://schemas.microsoft.com/office/word/2016/wordml/cid" xmlns:w16="http://schemas.microsoft.com/office/word/2018/wordml" xmlns:w16cex="http://schemas.microsoft.com/office/word/2018/wordml/cex" xmlns:w16sdtdh="http://schemas.microsoft.com/office/word/2020/wordml/sdtdatahash" xmlns:wne="http://schemas.microsoft.com/office/word/2006/wordml" xmlns:wpg="http://schemas.microsoft.com/office/word/2010/wordprocessingGroup" xmlns:wps="http://schemas.microsoft.com/office/word/2010/wordprocessingShape">
+<w:hdr xmlns:wpc="http://schemas.microsoft.com/office/word/2010/wordprocessingCanvas" xmlns:cx="http://schemas.microsoft.com/office/drawing/2014/chartex" xmlns:cx1="http://schemas.microsoft.com/office/drawing/2015/9/8/chartex" xmlns:cx2="http://schemas.microsoft.com/office/drawing/2015/10/21/chartex" xmlns:cx3="http://schemas.microsoft.com/office/drawing/2016/5/9/chartex" xmlns:cx4="http://schemas.microsoft.com/office/drawing/2016/5/10/chartex" xmlns:cx5="http://schemas.microsoft.com/office/drawing/2016/5/11/chartex" xmlns:cx6="http://schemas.microsoft.com/office/drawing/2016/5/12/chartex" xmlns:cx7="http://schemas.microsoft.com/office/drawing/2016/5/13/chartex" xmlns:cx8="http://schemas.microsoft.com/office/drawing/2016/5/14/chartex" xmlns:mc="http://schemas.openxmlformats.org/markup-compatibility/2006" xmlns:aink="http://schemas.microsoft.com/office/drawing/2016/ink" xmlns:am3d="http://schemas.microsoft.com/office/drawing/2017/model3d" xmlns:o="urn:schemas-microsoft-com:office:office" xmlns:oel="http://schemas.microsoft.com/office/2019/extlst" xmlns:r="http://schemas.openxmlformats.org/officeDocument/2006/relationships" xmlns:m="http://schemas.openxmlformats.org/officeDocument/2006/math" xmlns:v="urn:schemas-microsoft-com:vml" xmlns:wp14="http://schemas.microsoft.com/office/word/2010/wordprocessingDrawing" xmlns:wp="http://schemas.openxmlformats.org/drawingml/2006/wordprocessingDrawing" xmlns:w10="urn:schemas-microsoft-com:office:word" xmlns:w="http://schemas.openxmlformats.org/wordprocessingml/2006/main" xmlns:w14="http://schemas.microsoft.com/office/word/2010/wordml" xmlns:w15="http://schemas.microsoft.com/office/word/2012/wordml" xmlns:w16cex="http://schemas.microsoft.com/office/word/2018/wordml/cex" xmlns:w16cid="http://schemas.microsoft.com/office/word/2016/wordml/cid" xmlns:w16="http://schemas.microsoft.com/office/word/2018/wordml" xmlns:w16du="http://schemas.microsoft.com/office/word/2023/wordml/word16du" xmlns:w16sdtdh="http://schemas.microsoft.com/office/word/2020/wordml/sdtdatahash" xmlns:w16sdtfl="http://schemas.microsoft.com/office/word/2024/wordml/sdtformatlock" xmlns:w16se="http://schemas.microsoft.com/office/word/2015/wordml/symex" xmlns:wpg="http://schemas.microsoft.com/office/word/2010/wordprocessingGroup" xmlns:wpi="http://schemas.microsoft.com/office/word/2010/wordprocessingInk" xmlns:wne="http://schemas.microsoft.com/office/word/2006/wordml" xmlns:wps="http://schemas.microsoft.com/office/word/2010/wordprocessingShape" mc:Ignorable="w14 w15 w16se w16cid w16 w16cex w16sdtdh w16sdtfl w16du wp14">
   <w:p>
     <w:pPr>
       <w:pStyle w:val="Header"/>

</xml_diff>